<commit_message>
Debug linking communities names to informations
</commit_message>
<xml_diff>
--- a/01_prepare_exposure_data.docx
+++ b/01_prepare_exposure_data.docx
@@ -18,7 +18,7 @@
         <w:t xml:space="preserve">Matthias Lochmann</w:t>
       </w:r>
     </w:p>
-    <w:bookmarkStart w:id="20" w:name="datenformate"/>
+    <w:bookmarkStart w:id="9" w:name="datenformate"/>
     <w:p>
       <w:pPr>
         <w:pStyle w:val="Heading2"/>
@@ -35,8 +35,8 @@
         <w:t xml:space="preserve">Lärmexpositionsdaten werden häufig als Exceltabellen z.B. von Landes- oder Bundesämtern bereitgestellt. Deren jeweiliges Format ist oft ähnlich, unterscheidet sich aber in vielen Details. Um die Daten gut verarbeiten zu können, werden sie hier eingelesen und schön formatiert abgespeichert.</w:t>
       </w:r>
     </w:p>
-    <w:bookmarkEnd w:id="20"/>
-    <w:bookmarkStart w:id="22" w:name="vorliegende-dateien"/>
+    <w:bookmarkEnd w:id="9"/>
+    <w:bookmarkStart w:id="11" w:name="vorliegende-dateien"/>
     <w:p>
       <w:pPr>
         <w:pStyle w:val="Heading2"/>
@@ -110,7 +110,7 @@
       <w:tr>
         <w:tc>
           <w:tcPr/>
-          <w:bookmarkStart w:id="21" w:name="tbl-metadaten"/>
+          <w:bookmarkStart w:id="10" w:name="tbl-metadaten"/>
           <w:p>
             <w:pPr>
               <w:jc w:val="center"/>
@@ -2323,13 +2323,13 @@
               </w:tc>
             </w:tr>
           </w:tbl>
-          <w:bookmarkEnd w:id="21"/>
+          <w:bookmarkEnd w:id="10"/>
           <w:p/>
         </w:tc>
       </w:tr>
     </w:tbl>
-    <w:bookmarkEnd w:id="22"/>
-    <w:bookmarkStart w:id="23" w:name="verarbeitung-expositionsdaten"/>
+    <w:bookmarkEnd w:id="11"/>
+    <w:bookmarkStart w:id="14" w:name="verarbeitung-expositionsdaten"/>
     <w:p>
       <w:pPr>
         <w:pStyle w:val="Heading2"/>
@@ -2358,11 +2358,927 @@
         <w:t xml:space="preserve">transformiert.</w:t>
       </w:r>
     </w:p>
-    <w:bookmarkEnd w:id="23"/>
-    <w:bookmarkStart w:id="24" w:name="geocode-vereinheitlichen"/>
+    <w:bookmarkStart w:id="13" w:name="country-codes"/>
+    <w:p>
+      <w:pPr>
+        <w:pStyle w:val="Heading3"/>
+      </w:pPr>
+      <w:r>
+        <w:t xml:space="preserve">Country codes</w:t>
+      </w:r>
+    </w:p>
+    <w:p>
+      <w:pPr>
+        <w:pStyle w:val="FirstParagraph"/>
+      </w:pPr>
+      <w:r>
+        <w:t xml:space="preserve">To unify the country designation, we use the</w:t>
+      </w:r>
+      <w:r>
+        <w:t xml:space="preserve"> </w:t>
+      </w:r>
+      <w:hyperlink r:id="rId12">
+        <w:r>
+          <w:rPr>
+            <w:rStyle w:val="Hyperlink"/>
+          </w:rPr>
+          <w:t xml:space="preserve">ISO 3166-1</w:t>
+        </w:r>
+      </w:hyperlink>
+      <w:r>
+        <w:t xml:space="preserve"> </w:t>
+      </w:r>
+      <w:r>
+        <w:t xml:space="preserve">List of countries and their two letter codes.</w:t>
+      </w:r>
+    </w:p>
+    <w:tbl>
+      <w:tblPr>
+        <w:tblStyle w:val="Table"/>
+        <w:tblW w:type="auto" w:w="0"/>
+        <w:tblLook w:firstRow="1" w:lastRow="0" w:firstColumn="0" w:lastColumn="0" w:noHBand="0" w:noVBand="0" w:val="0020"/>
+      </w:tblPr>
+      <w:tblGrid>
+        <w:gridCol w:w="3960"/>
+        <w:gridCol w:w="3960"/>
+      </w:tblGrid>
+      <w:tr>
+        <w:trPr>
+          <w:tblHeader w:val="on"/>
+        </w:trPr>
+        <w:tc>
+          <w:tcPr/>
+          <w:p>
+            <w:pPr>
+              <w:pStyle w:val="Compact"/>
+              <w:jc w:val="left"/>
+            </w:pPr>
+            <w:r>
+              <w:t xml:space="preserve">country</w:t>
+            </w:r>
+          </w:p>
+        </w:tc>
+        <w:tc>
+          <w:tcPr/>
+          <w:p>
+            <w:pPr>
+              <w:pStyle w:val="Compact"/>
+              <w:jc w:val="left"/>
+            </w:pPr>
+            <w:r>
+              <w:t xml:space="preserve">iso_code</w:t>
+            </w:r>
+          </w:p>
+        </w:tc>
+      </w:tr>
+      <w:tr>
+        <w:tc>
+          <w:tcPr/>
+          <w:p>
+            <w:pPr>
+              <w:pStyle w:val="Compact"/>
+              <w:jc w:val="left"/>
+            </w:pPr>
+            <w:r>
+              <w:t xml:space="preserve">Germany</w:t>
+            </w:r>
+          </w:p>
+        </w:tc>
+        <w:tc>
+          <w:tcPr/>
+          <w:p>
+            <w:pPr>
+              <w:pStyle w:val="Compact"/>
+              <w:jc w:val="left"/>
+            </w:pPr>
+            <w:r>
+              <w:t xml:space="preserve">DE</w:t>
+            </w:r>
+          </w:p>
+        </w:tc>
+      </w:tr>
+      <w:tr>
+        <w:tc>
+          <w:tcPr/>
+          <w:p>
+            <w:pPr>
+              <w:pStyle w:val="Compact"/>
+              <w:jc w:val="left"/>
+            </w:pPr>
+            <w:r>
+              <w:t xml:space="preserve">Austria</w:t>
+            </w:r>
+          </w:p>
+        </w:tc>
+        <w:tc>
+          <w:tcPr/>
+          <w:p>
+            <w:pPr>
+              <w:pStyle w:val="Compact"/>
+              <w:jc w:val="left"/>
+            </w:pPr>
+            <w:r>
+              <w:t xml:space="preserve">AT</w:t>
+            </w:r>
+          </w:p>
+        </w:tc>
+      </w:tr>
+      <w:tr>
+        <w:tc>
+          <w:tcPr/>
+          <w:p>
+            <w:pPr>
+              <w:pStyle w:val="Compact"/>
+              <w:jc w:val="left"/>
+            </w:pPr>
+            <w:r>
+              <w:t xml:space="preserve">Belgium</w:t>
+            </w:r>
+          </w:p>
+        </w:tc>
+        <w:tc>
+          <w:tcPr/>
+          <w:p>
+            <w:pPr>
+              <w:pStyle w:val="Compact"/>
+              <w:jc w:val="left"/>
+            </w:pPr>
+            <w:r>
+              <w:t xml:space="preserve">BE</w:t>
+            </w:r>
+          </w:p>
+        </w:tc>
+      </w:tr>
+      <w:tr>
+        <w:tc>
+          <w:tcPr/>
+          <w:p>
+            <w:pPr>
+              <w:pStyle w:val="Compact"/>
+              <w:jc w:val="left"/>
+            </w:pPr>
+            <w:r>
+              <w:t xml:space="preserve">Bulgaria</w:t>
+            </w:r>
+          </w:p>
+        </w:tc>
+        <w:tc>
+          <w:tcPr/>
+          <w:p>
+            <w:pPr>
+              <w:pStyle w:val="Compact"/>
+              <w:jc w:val="left"/>
+            </w:pPr>
+            <w:r>
+              <w:t xml:space="preserve">BG</w:t>
+            </w:r>
+          </w:p>
+        </w:tc>
+      </w:tr>
+      <w:tr>
+        <w:tc>
+          <w:tcPr/>
+          <w:p>
+            <w:pPr>
+              <w:pStyle w:val="Compact"/>
+              <w:jc w:val="left"/>
+            </w:pPr>
+            <w:r>
+              <w:t xml:space="preserve">Croatia</w:t>
+            </w:r>
+          </w:p>
+        </w:tc>
+        <w:tc>
+          <w:tcPr/>
+          <w:p>
+            <w:pPr>
+              <w:pStyle w:val="Compact"/>
+              <w:jc w:val="left"/>
+            </w:pPr>
+            <w:r>
+              <w:t xml:space="preserve">HR</w:t>
+            </w:r>
+          </w:p>
+        </w:tc>
+      </w:tr>
+      <w:tr>
+        <w:tc>
+          <w:tcPr/>
+          <w:p>
+            <w:pPr>
+              <w:pStyle w:val="Compact"/>
+              <w:jc w:val="left"/>
+            </w:pPr>
+            <w:r>
+              <w:t xml:space="preserve">Cyprus</w:t>
+            </w:r>
+          </w:p>
+        </w:tc>
+        <w:tc>
+          <w:tcPr/>
+          <w:p>
+            <w:pPr>
+              <w:pStyle w:val="Compact"/>
+              <w:jc w:val="left"/>
+            </w:pPr>
+            <w:r>
+              <w:t xml:space="preserve">CY</w:t>
+            </w:r>
+          </w:p>
+        </w:tc>
+      </w:tr>
+      <w:tr>
+        <w:tc>
+          <w:tcPr/>
+          <w:p>
+            <w:pPr>
+              <w:pStyle w:val="Compact"/>
+              <w:jc w:val="left"/>
+            </w:pPr>
+            <w:r>
+              <w:t xml:space="preserve">Czech Republic</w:t>
+            </w:r>
+          </w:p>
+        </w:tc>
+        <w:tc>
+          <w:tcPr/>
+          <w:p>
+            <w:pPr>
+              <w:pStyle w:val="Compact"/>
+              <w:jc w:val="left"/>
+            </w:pPr>
+            <w:r>
+              <w:t xml:space="preserve">NA</w:t>
+            </w:r>
+          </w:p>
+        </w:tc>
+      </w:tr>
+      <w:tr>
+        <w:tc>
+          <w:tcPr/>
+          <w:p>
+            <w:pPr>
+              <w:pStyle w:val="Compact"/>
+              <w:jc w:val="left"/>
+            </w:pPr>
+            <w:r>
+              <w:t xml:space="preserve">Denmark</w:t>
+            </w:r>
+          </w:p>
+        </w:tc>
+        <w:tc>
+          <w:tcPr/>
+          <w:p>
+            <w:pPr>
+              <w:pStyle w:val="Compact"/>
+              <w:jc w:val="left"/>
+            </w:pPr>
+            <w:r>
+              <w:t xml:space="preserve">DK</w:t>
+            </w:r>
+          </w:p>
+        </w:tc>
+      </w:tr>
+      <w:tr>
+        <w:tc>
+          <w:tcPr/>
+          <w:p>
+            <w:pPr>
+              <w:pStyle w:val="Compact"/>
+              <w:jc w:val="left"/>
+            </w:pPr>
+            <w:r>
+              <w:t xml:space="preserve">Estonia</w:t>
+            </w:r>
+          </w:p>
+        </w:tc>
+        <w:tc>
+          <w:tcPr/>
+          <w:p>
+            <w:pPr>
+              <w:pStyle w:val="Compact"/>
+              <w:jc w:val="left"/>
+            </w:pPr>
+            <w:r>
+              <w:t xml:space="preserve">EE</w:t>
+            </w:r>
+          </w:p>
+        </w:tc>
+      </w:tr>
+      <w:tr>
+        <w:tc>
+          <w:tcPr/>
+          <w:p>
+            <w:pPr>
+              <w:pStyle w:val="Compact"/>
+              <w:jc w:val="left"/>
+            </w:pPr>
+            <w:r>
+              <w:t xml:space="preserve">Finland</w:t>
+            </w:r>
+          </w:p>
+        </w:tc>
+        <w:tc>
+          <w:tcPr/>
+          <w:p>
+            <w:pPr>
+              <w:pStyle w:val="Compact"/>
+              <w:jc w:val="left"/>
+            </w:pPr>
+            <w:r>
+              <w:t xml:space="preserve">FI</w:t>
+            </w:r>
+          </w:p>
+        </w:tc>
+      </w:tr>
+      <w:tr>
+        <w:tc>
+          <w:tcPr/>
+          <w:p>
+            <w:pPr>
+              <w:pStyle w:val="Compact"/>
+              <w:jc w:val="left"/>
+            </w:pPr>
+            <w:r>
+              <w:t xml:space="preserve">France</w:t>
+            </w:r>
+          </w:p>
+        </w:tc>
+        <w:tc>
+          <w:tcPr/>
+          <w:p>
+            <w:pPr>
+              <w:pStyle w:val="Compact"/>
+              <w:jc w:val="left"/>
+            </w:pPr>
+            <w:r>
+              <w:t xml:space="preserve">FR</w:t>
+            </w:r>
+          </w:p>
+        </w:tc>
+      </w:tr>
+      <w:tr>
+        <w:tc>
+          <w:tcPr/>
+          <w:p>
+            <w:pPr>
+              <w:pStyle w:val="Compact"/>
+              <w:jc w:val="left"/>
+            </w:pPr>
+            <w:r>
+              <w:t xml:space="preserve">Greece</w:t>
+            </w:r>
+          </w:p>
+        </w:tc>
+        <w:tc>
+          <w:tcPr/>
+          <w:p>
+            <w:pPr>
+              <w:pStyle w:val="Compact"/>
+              <w:jc w:val="left"/>
+            </w:pPr>
+            <w:r>
+              <w:t xml:space="preserve">GR</w:t>
+            </w:r>
+          </w:p>
+        </w:tc>
+      </w:tr>
+      <w:tr>
+        <w:tc>
+          <w:tcPr/>
+          <w:p>
+            <w:pPr>
+              <w:pStyle w:val="Compact"/>
+              <w:jc w:val="left"/>
+            </w:pPr>
+            <w:r>
+              <w:t xml:space="preserve">Hungary</w:t>
+            </w:r>
+          </w:p>
+        </w:tc>
+        <w:tc>
+          <w:tcPr/>
+          <w:p>
+            <w:pPr>
+              <w:pStyle w:val="Compact"/>
+              <w:jc w:val="left"/>
+            </w:pPr>
+            <w:r>
+              <w:t xml:space="preserve">HU</w:t>
+            </w:r>
+          </w:p>
+        </w:tc>
+      </w:tr>
+      <w:tr>
+        <w:tc>
+          <w:tcPr/>
+          <w:p>
+            <w:pPr>
+              <w:pStyle w:val="Compact"/>
+              <w:jc w:val="left"/>
+            </w:pPr>
+            <w:r>
+              <w:t xml:space="preserve">Iceland</w:t>
+            </w:r>
+          </w:p>
+        </w:tc>
+        <w:tc>
+          <w:tcPr/>
+          <w:p>
+            <w:pPr>
+              <w:pStyle w:val="Compact"/>
+              <w:jc w:val="left"/>
+            </w:pPr>
+            <w:r>
+              <w:t xml:space="preserve">IS</w:t>
+            </w:r>
+          </w:p>
+        </w:tc>
+      </w:tr>
+      <w:tr>
+        <w:tc>
+          <w:tcPr/>
+          <w:p>
+            <w:pPr>
+              <w:pStyle w:val="Compact"/>
+              <w:jc w:val="left"/>
+            </w:pPr>
+            <w:r>
+              <w:t xml:space="preserve">Ireland</w:t>
+            </w:r>
+          </w:p>
+        </w:tc>
+        <w:tc>
+          <w:tcPr/>
+          <w:p>
+            <w:pPr>
+              <w:pStyle w:val="Compact"/>
+              <w:jc w:val="left"/>
+            </w:pPr>
+            <w:r>
+              <w:t xml:space="preserve">IE</w:t>
+            </w:r>
+          </w:p>
+        </w:tc>
+      </w:tr>
+      <w:tr>
+        <w:tc>
+          <w:tcPr/>
+          <w:p>
+            <w:pPr>
+              <w:pStyle w:val="Compact"/>
+              <w:jc w:val="left"/>
+            </w:pPr>
+            <w:r>
+              <w:t xml:space="preserve">Italy</w:t>
+            </w:r>
+          </w:p>
+        </w:tc>
+        <w:tc>
+          <w:tcPr/>
+          <w:p>
+            <w:pPr>
+              <w:pStyle w:val="Compact"/>
+              <w:jc w:val="left"/>
+            </w:pPr>
+            <w:r>
+              <w:t xml:space="preserve">IT</w:t>
+            </w:r>
+          </w:p>
+        </w:tc>
+      </w:tr>
+      <w:tr>
+        <w:tc>
+          <w:tcPr/>
+          <w:p>
+            <w:pPr>
+              <w:pStyle w:val="Compact"/>
+              <w:jc w:val="left"/>
+            </w:pPr>
+            <w:r>
+              <w:t xml:space="preserve">Latvia</w:t>
+            </w:r>
+          </w:p>
+        </w:tc>
+        <w:tc>
+          <w:tcPr/>
+          <w:p>
+            <w:pPr>
+              <w:pStyle w:val="Compact"/>
+              <w:jc w:val="left"/>
+            </w:pPr>
+            <w:r>
+              <w:t xml:space="preserve">LV</w:t>
+            </w:r>
+          </w:p>
+        </w:tc>
+      </w:tr>
+      <w:tr>
+        <w:tc>
+          <w:tcPr/>
+          <w:p>
+            <w:pPr>
+              <w:pStyle w:val="Compact"/>
+              <w:jc w:val="left"/>
+            </w:pPr>
+            <w:r>
+              <w:t xml:space="preserve">Liechtenstein</w:t>
+            </w:r>
+          </w:p>
+        </w:tc>
+        <w:tc>
+          <w:tcPr/>
+          <w:p>
+            <w:pPr>
+              <w:pStyle w:val="Compact"/>
+              <w:jc w:val="left"/>
+            </w:pPr>
+            <w:r>
+              <w:t xml:space="preserve">LI</w:t>
+            </w:r>
+          </w:p>
+        </w:tc>
+      </w:tr>
+      <w:tr>
+        <w:tc>
+          <w:tcPr/>
+          <w:p>
+            <w:pPr>
+              <w:pStyle w:val="Compact"/>
+              <w:jc w:val="left"/>
+            </w:pPr>
+            <w:r>
+              <w:t xml:space="preserve">Lithuania</w:t>
+            </w:r>
+          </w:p>
+        </w:tc>
+        <w:tc>
+          <w:tcPr/>
+          <w:p>
+            <w:pPr>
+              <w:pStyle w:val="Compact"/>
+              <w:jc w:val="left"/>
+            </w:pPr>
+            <w:r>
+              <w:t xml:space="preserve">LT</w:t>
+            </w:r>
+          </w:p>
+        </w:tc>
+      </w:tr>
+      <w:tr>
+        <w:tc>
+          <w:tcPr/>
+          <w:p>
+            <w:pPr>
+              <w:pStyle w:val="Compact"/>
+              <w:jc w:val="left"/>
+            </w:pPr>
+            <w:r>
+              <w:t xml:space="preserve">Luxembourg</w:t>
+            </w:r>
+          </w:p>
+        </w:tc>
+        <w:tc>
+          <w:tcPr/>
+          <w:p>
+            <w:pPr>
+              <w:pStyle w:val="Compact"/>
+              <w:jc w:val="left"/>
+            </w:pPr>
+            <w:r>
+              <w:t xml:space="preserve">LU</w:t>
+            </w:r>
+          </w:p>
+        </w:tc>
+      </w:tr>
+      <w:tr>
+        <w:tc>
+          <w:tcPr/>
+          <w:p>
+            <w:pPr>
+              <w:pStyle w:val="Compact"/>
+              <w:jc w:val="left"/>
+            </w:pPr>
+            <w:r>
+              <w:t xml:space="preserve">Malta</w:t>
+            </w:r>
+          </w:p>
+        </w:tc>
+        <w:tc>
+          <w:tcPr/>
+          <w:p>
+            <w:pPr>
+              <w:pStyle w:val="Compact"/>
+              <w:jc w:val="left"/>
+            </w:pPr>
+            <w:r>
+              <w:t xml:space="preserve">MT</w:t>
+            </w:r>
+          </w:p>
+        </w:tc>
+      </w:tr>
+      <w:tr>
+        <w:tc>
+          <w:tcPr/>
+          <w:p>
+            <w:pPr>
+              <w:pStyle w:val="Compact"/>
+              <w:jc w:val="left"/>
+            </w:pPr>
+            <w:r>
+              <w:t xml:space="preserve">Netherlands</w:t>
+            </w:r>
+          </w:p>
+        </w:tc>
+        <w:tc>
+          <w:tcPr/>
+          <w:p>
+            <w:pPr>
+              <w:pStyle w:val="Compact"/>
+              <w:jc w:val="left"/>
+            </w:pPr>
+            <w:r>
+              <w:t xml:space="preserve">NA</w:t>
+            </w:r>
+          </w:p>
+        </w:tc>
+      </w:tr>
+      <w:tr>
+        <w:tc>
+          <w:tcPr/>
+          <w:p>
+            <w:pPr>
+              <w:pStyle w:val="Compact"/>
+              <w:jc w:val="left"/>
+            </w:pPr>
+            <w:r>
+              <w:t xml:space="preserve">Norway</w:t>
+            </w:r>
+          </w:p>
+        </w:tc>
+        <w:tc>
+          <w:tcPr/>
+          <w:p>
+            <w:pPr>
+              <w:pStyle w:val="Compact"/>
+              <w:jc w:val="left"/>
+            </w:pPr>
+            <w:r>
+              <w:t xml:space="preserve">NO</w:t>
+            </w:r>
+          </w:p>
+        </w:tc>
+      </w:tr>
+      <w:tr>
+        <w:tc>
+          <w:tcPr/>
+          <w:p>
+            <w:pPr>
+              <w:pStyle w:val="Compact"/>
+              <w:jc w:val="left"/>
+            </w:pPr>
+            <w:r>
+              <w:t xml:space="preserve">Poland</w:t>
+            </w:r>
+          </w:p>
+        </w:tc>
+        <w:tc>
+          <w:tcPr/>
+          <w:p>
+            <w:pPr>
+              <w:pStyle w:val="Compact"/>
+              <w:jc w:val="left"/>
+            </w:pPr>
+            <w:r>
+              <w:t xml:space="preserve">PL</w:t>
+            </w:r>
+          </w:p>
+        </w:tc>
+      </w:tr>
+      <w:tr>
+        <w:tc>
+          <w:tcPr/>
+          <w:p>
+            <w:pPr>
+              <w:pStyle w:val="Compact"/>
+              <w:jc w:val="left"/>
+            </w:pPr>
+            <w:r>
+              <w:t xml:space="preserve">Portugal</w:t>
+            </w:r>
+          </w:p>
+        </w:tc>
+        <w:tc>
+          <w:tcPr/>
+          <w:p>
+            <w:pPr>
+              <w:pStyle w:val="Compact"/>
+              <w:jc w:val="left"/>
+            </w:pPr>
+            <w:r>
+              <w:t xml:space="preserve">PT</w:t>
+            </w:r>
+          </w:p>
+        </w:tc>
+      </w:tr>
+      <w:tr>
+        <w:tc>
+          <w:tcPr/>
+          <w:p>
+            <w:pPr>
+              <w:pStyle w:val="Compact"/>
+              <w:jc w:val="left"/>
+            </w:pPr>
+            <w:r>
+              <w:t xml:space="preserve">Romania</w:t>
+            </w:r>
+          </w:p>
+        </w:tc>
+        <w:tc>
+          <w:tcPr/>
+          <w:p>
+            <w:pPr>
+              <w:pStyle w:val="Compact"/>
+              <w:jc w:val="left"/>
+            </w:pPr>
+            <w:r>
+              <w:t xml:space="preserve">RO</w:t>
+            </w:r>
+          </w:p>
+        </w:tc>
+      </w:tr>
+      <w:tr>
+        <w:tc>
+          <w:tcPr/>
+          <w:p>
+            <w:pPr>
+              <w:pStyle w:val="Compact"/>
+              <w:jc w:val="left"/>
+            </w:pPr>
+            <w:r>
+              <w:t xml:space="preserve">Slovakia</w:t>
+            </w:r>
+          </w:p>
+        </w:tc>
+        <w:tc>
+          <w:tcPr/>
+          <w:p>
+            <w:pPr>
+              <w:pStyle w:val="Compact"/>
+              <w:jc w:val="left"/>
+            </w:pPr>
+            <w:r>
+              <w:t xml:space="preserve">SK</w:t>
+            </w:r>
+          </w:p>
+        </w:tc>
+      </w:tr>
+      <w:tr>
+        <w:tc>
+          <w:tcPr/>
+          <w:p>
+            <w:pPr>
+              <w:pStyle w:val="Compact"/>
+              <w:jc w:val="left"/>
+            </w:pPr>
+            <w:r>
+              <w:t xml:space="preserve">Slovenia</w:t>
+            </w:r>
+          </w:p>
+        </w:tc>
+        <w:tc>
+          <w:tcPr/>
+          <w:p>
+            <w:pPr>
+              <w:pStyle w:val="Compact"/>
+              <w:jc w:val="left"/>
+            </w:pPr>
+            <w:r>
+              <w:t xml:space="preserve">SI</w:t>
+            </w:r>
+          </w:p>
+        </w:tc>
+      </w:tr>
+      <w:tr>
+        <w:tc>
+          <w:tcPr/>
+          <w:p>
+            <w:pPr>
+              <w:pStyle w:val="Compact"/>
+              <w:jc w:val="left"/>
+            </w:pPr>
+            <w:r>
+              <w:t xml:space="preserve">Spain</w:t>
+            </w:r>
+          </w:p>
+        </w:tc>
+        <w:tc>
+          <w:tcPr/>
+          <w:p>
+            <w:pPr>
+              <w:pStyle w:val="Compact"/>
+              <w:jc w:val="left"/>
+            </w:pPr>
+            <w:r>
+              <w:t xml:space="preserve">ES</w:t>
+            </w:r>
+          </w:p>
+        </w:tc>
+      </w:tr>
+      <w:tr>
+        <w:tc>
+          <w:tcPr/>
+          <w:p>
+            <w:pPr>
+              <w:pStyle w:val="Compact"/>
+              <w:jc w:val="left"/>
+            </w:pPr>
+            <w:r>
+              <w:t xml:space="preserve">Sweden</w:t>
+            </w:r>
+          </w:p>
+        </w:tc>
+        <w:tc>
+          <w:tcPr/>
+          <w:p>
+            <w:pPr>
+              <w:pStyle w:val="Compact"/>
+              <w:jc w:val="left"/>
+            </w:pPr>
+            <w:r>
+              <w:t xml:space="preserve">SE</w:t>
+            </w:r>
+          </w:p>
+        </w:tc>
+      </w:tr>
+      <w:tr>
+        <w:tc>
+          <w:tcPr/>
+          <w:p>
+            <w:pPr>
+              <w:pStyle w:val="Compact"/>
+              <w:jc w:val="left"/>
+            </w:pPr>
+            <w:r>
+              <w:t xml:space="preserve">Switzerland</w:t>
+            </w:r>
+          </w:p>
+        </w:tc>
+        <w:tc>
+          <w:tcPr/>
+          <w:p>
+            <w:pPr>
+              <w:pStyle w:val="Compact"/>
+              <w:jc w:val="left"/>
+            </w:pPr>
+            <w:r>
+              <w:t xml:space="preserve">CH</w:t>
+            </w:r>
+          </w:p>
+        </w:tc>
+      </w:tr>
+      <w:tr>
+        <w:tc>
+          <w:tcPr/>
+          <w:p>
+            <w:pPr>
+              <w:pStyle w:val="Compact"/>
+              <w:jc w:val="left"/>
+            </w:pPr>
+            <w:r>
+              <w:t xml:space="preserve">Türkiye</w:t>
+            </w:r>
+          </w:p>
+        </w:tc>
+        <w:tc>
+          <w:tcPr/>
+          <w:p>
+            <w:pPr>
+              <w:pStyle w:val="Compact"/>
+              <w:jc w:val="left"/>
+            </w:pPr>
+            <w:r>
+              <w:t xml:space="preserve">TR</w:t>
+            </w:r>
+          </w:p>
+        </w:tc>
+      </w:tr>
+    </w:tbl>
+    <w:bookmarkEnd w:id="13"/>
+    <w:bookmarkEnd w:id="14"/>
+    <w:bookmarkStart w:id="20" w:name="deutsche-daten"/>
     <w:p>
       <w:pPr>
         <w:pStyle w:val="Heading2"/>
+      </w:pPr>
+      <w:r>
+        <w:t xml:space="preserve">Deutsche Daten</w:t>
+      </w:r>
+    </w:p>
+    <w:bookmarkStart w:id="15" w:name="geocode-vereinheitlichen"/>
+    <w:p>
+      <w:pPr>
+        <w:pStyle w:val="Heading3"/>
       </w:pPr>
       <w:r>
         <w:t xml:space="preserve">Geocode vereinheitlichen</w:t>
@@ -3042,14 +3958,32 @@
         <w:pStyle w:val="BodyText"/>
       </w:pPr>
       <w:r>
-        <w:t xml:space="preserve">Hier wird sie nun vereinheitlicht auf das 8-stellige Format mit dem führenden zweistelligen Bundesland-Code.</w:t>
+        <w:t xml:space="preserve">Bei den deutschen Daten wird die Gemeindekennziffer auf das 8-stellige Format mit dem führenden zweistelligen Bundesland-Code vereinheitlicht.</w:t>
       </w:r>
     </w:p>
-    <w:bookmarkEnd w:id="24"/>
-    <w:bookmarkStart w:id="26" w:name="X288efa3c08b4339e3352661b31cf6df9444cd67"/>
+    <w:bookmarkEnd w:id="15"/>
+    <w:bookmarkStart w:id="16" w:name="wiedereinlesen-destatisdaten"/>
     <w:p>
       <w:pPr>
-        <w:pStyle w:val="Heading2"/>
+        <w:pStyle w:val="Heading3"/>
+      </w:pPr>
+      <w:r>
+        <w:t xml:space="preserve">Wiedereinlesen Destatisdaten</w:t>
+      </w:r>
+    </w:p>
+    <w:p>
+      <w:pPr>
+        <w:pStyle w:val="FirstParagraph"/>
+      </w:pPr>
+      <w:r>
+        <w:t xml:space="preserve">Hier wird sie nun vereinheitlicht auf das 8-stellige Format mit dem führenden zweistelligen Bundesland-Code. </w:t>
+      </w:r>
+    </w:p>
+    <w:bookmarkEnd w:id="16"/>
+    <w:bookmarkStart w:id="17" w:name="X288efa3c08b4339e3352661b31cf6df9444cd67"/>
+    <w:p>
+      <w:pPr>
+        <w:pStyle w:val="Heading3"/>
       </w:pPr>
       <w:r>
         <w:t xml:space="preserve">Anreichern mit Gemeindeverzeichnis Daten (Destatis)</w:t>
@@ -3058,531 +3992,6 @@
     <w:p>
       <w:pPr>
         <w:pStyle w:val="FirstParagraph"/>
-      </w:pPr>
-      <w:r>
-        <w:t xml:space="preserve">Die Datei</w:t>
-      </w:r>
-    </w:p>
-    <w:p>
-      <w:pPr>
-        <w:pStyle w:val="SourceCode"/>
-      </w:pPr>
-      <w:r>
-        <w:rPr>
-          <w:rStyle w:val="VerbatimChar"/>
-        </w:rPr>
-        <w:t xml:space="preserve">[1] "data/Gebietstabellen/raw/GV100AD_31122022.txt"</w:t>
-      </w:r>
-    </w:p>
-    <w:p>
-      <w:pPr>
-        <w:pStyle w:val="FirstParagraph"/>
-      </w:pPr>
-      <w:r>
-        <w:t xml:space="preserve">liegt in einem</w:t>
-      </w:r>
-      <w:r>
-        <w:t xml:space="preserve"> </w:t>
-      </w:r>
-      <w:r>
-        <w:t xml:space="preserve">“fixed width”</w:t>
-      </w:r>
-      <w:r>
-        <w:t xml:space="preserve"> </w:t>
-      </w:r>
-      <w:r>
-        <w:t xml:space="preserve">Format vor, welches gut maschinen- aber schlecht menschenlesbar ist. Hier werden nur die relevanten Zeilen eingelesen,</w:t>
-      </w:r>
-    </w:p>
-    <w:p>
-      <w:pPr>
-        <w:pStyle w:val="BodyText"/>
-      </w:pPr>
-      <w:r>
-        <w:t xml:space="preserve">und die Felder</w:t>
-      </w:r>
-      <w:r>
-        <w:t xml:space="preserve"> </w:t>
-      </w:r>
-      <w:r>
-        <w:t xml:space="preserve">“gemeinde_kennziffer, gemeinde_bezeichnung, bevoelkerung”</w:t>
-      </w:r>
-      <w:r>
-        <w:t xml:space="preserve"> </w:t>
-      </w:r>
-      <w:r>
-        <w:t xml:space="preserve">extrahiert. Ein Auszug daraus findet sich in</w:t>
-      </w:r>
-      <w:r>
-        <w:t xml:space="preserve"> </w:t>
-      </w:r>
-      <w:hyperlink w:anchor="tbl-gemeindeverzeichnis">
-        <w:r>
-          <w:rPr>
-            <w:rStyle w:val="Hyperlink"/>
-          </w:rPr>
-          <w:t xml:space="preserve">Table 2</w:t>
-        </w:r>
-      </w:hyperlink>
-      <w:r>
-        <w:t xml:space="preserve">.</w:t>
-      </w:r>
-    </w:p>
-    <w:tbl>
-      <w:tblPr>
-        <w:tblStyle w:val="Table"/>
-        <w:tblW w:type="pct" w:w="5000"/>
-        <w:tblLayout w:type="fixed"/>
-        <w:tblLook w:firstRow="0" w:lastRow="0" w:firstColumn="0" w:lastColumn="0" w:noHBand="0" w:noVBand="0" w:val="0000"/>
-      </w:tblPr>
-      <w:tblGrid>
-        <w:gridCol w:w="7920"/>
-      </w:tblGrid>
-      <w:tr>
-        <w:tc>
-          <w:tcPr/>
-          <w:bookmarkStart w:id="25" w:name="tbl-gemeindeverzeichnis"/>
-          <w:p>
-            <w:pPr>
-              <w:jc w:val="center"/>
-            </w:pPr>
-            <w:pPr>
-              <w:jc w:val="left"/>
-              <w:spacing w:before="200"/>
-              <w:pStyle w:val="ImageCaption"/>
-            </w:pPr>
-            <w:r>
-              <w:t xml:space="preserve">Table 2: Ein Auszug aus dem so gewonnenen Gemeindeverzeichnis</w:t>
-            </w:r>
-          </w:p>
-          <w:tbl>
-            <w:tblPr>
-              <w:tblStyle w:val="Table"/>
-              <w:tblW w:type="pct" w:w="4950"/>
-              <w:tblLayout w:type="fixed"/>
-              <w:tblLook w:firstRow="1" w:lastRow="0" w:firstColumn="0" w:lastColumn="0" w:noHBand="0" w:noVBand="0" w:val="0020"/>
-            </w:tblPr>
-            <w:tblGrid>
-              <w:gridCol w:w="2138"/>
-              <w:gridCol w:w="1425"/>
-              <w:gridCol w:w="1425"/>
-              <w:gridCol w:w="1425"/>
-              <w:gridCol w:w="1425"/>
-            </w:tblGrid>
-            <w:tr>
-              <w:trPr>
-                <w:tblHeader w:val="on"/>
-              </w:trPr>
-              <w:tc>
-                <w:tcPr/>
-                <w:p>
-                  <w:pPr>
-                    <w:pStyle w:val="Compact"/>
-                    <w:jc w:val="left"/>
-                    <w:jc w:val="center"/>
-                  </w:pPr>
-                  <w:r>
-                    <w:t xml:space="preserve">gemeinde_kennziffer</w:t>
-                  </w:r>
-                </w:p>
-              </w:tc>
-              <w:tc>
-                <w:tcPr/>
-                <w:p>
-                  <w:pPr>
-                    <w:pStyle w:val="Compact"/>
-                    <w:jc w:val="left"/>
-                    <w:jc w:val="center"/>
-                  </w:pPr>
-                  <w:r>
-                    <w:t xml:space="preserve">gemeinde_bezeichnung</w:t>
-                  </w:r>
-                </w:p>
-              </w:tc>
-              <w:tc>
-                <w:tcPr/>
-                <w:p>
-                  <w:pPr>
-                    <w:pStyle w:val="Compact"/>
-                    <w:jc w:val="left"/>
-                    <w:jc w:val="center"/>
-                  </w:pPr>
-                  <w:r>
-                    <w:t xml:space="preserve">gemeinde_kennzeichnung</w:t>
-                  </w:r>
-                </w:p>
-              </w:tc>
-              <w:tc>
-                <w:tcPr/>
-                <w:p>
-                  <w:pPr>
-                    <w:pStyle w:val="Compact"/>
-                    <w:jc w:val="right"/>
-                    <w:jc w:val="center"/>
-                  </w:pPr>
-                  <w:r>
-                    <w:t xml:space="preserve">bevoelkerung</w:t>
-                  </w:r>
-                </w:p>
-              </w:tc>
-              <w:tc>
-                <w:tcPr/>
-                <w:p>
-                  <w:pPr>
-                    <w:pStyle w:val="Compact"/>
-                    <w:jc w:val="right"/>
-                    <w:jc w:val="center"/>
-                  </w:pPr>
-                  <w:r>
-                    <w:t xml:space="preserve">flaeche</w:t>
-                  </w:r>
-                </w:p>
-              </w:tc>
-            </w:tr>
-            <w:tr>
-              <w:tc>
-                <w:tcPr/>
-                <w:p>
-                  <w:pPr>
-                    <w:pStyle w:val="Compact"/>
-                    <w:jc w:val="left"/>
-                    <w:jc w:val="center"/>
-                  </w:pPr>
-                  <w:r>
-                    <w:t xml:space="preserve">05162020</w:t>
-                  </w:r>
-                </w:p>
-              </w:tc>
-              <w:tc>
-                <w:tcPr/>
-                <w:p>
-                  <w:pPr>
-                    <w:pStyle w:val="Compact"/>
-                    <w:jc w:val="left"/>
-                    <w:jc w:val="center"/>
-                  </w:pPr>
-                  <w:r>
-                    <w:t xml:space="preserve">Korschenbroich, Stadt</w:t>
-                  </w:r>
-                </w:p>
-              </w:tc>
-              <w:tc>
-                <w:tcPr/>
-                <w:p>
-                  <w:pPr>
-                    <w:pStyle w:val="Compact"/>
-                    <w:jc w:val="left"/>
-                    <w:jc w:val="center"/>
-                  </w:pPr>
-                  <w:r>
-                    <w:t xml:space="preserve">Stadt</w:t>
-                  </w:r>
-                </w:p>
-              </w:tc>
-              <w:tc>
-                <w:tcPr/>
-                <w:p>
-                  <w:pPr>
-                    <w:pStyle w:val="Compact"/>
-                    <w:jc w:val="right"/>
-                    <w:jc w:val="center"/>
-                  </w:pPr>
-                  <w:r>
-                    <w:t xml:space="preserve">34187</w:t>
-                  </w:r>
-                </w:p>
-              </w:tc>
-              <w:tc>
-                <w:tcPr/>
-                <w:p>
-                  <w:pPr>
-                    <w:pStyle w:val="Compact"/>
-                    <w:jc w:val="right"/>
-                    <w:jc w:val="center"/>
-                  </w:pPr>
-                  <w:r>
-                    <w:t xml:space="preserve">5526</w:t>
-                  </w:r>
-                </w:p>
-              </w:tc>
-            </w:tr>
-            <w:tr>
-              <w:tc>
-                <w:tcPr/>
-                <w:p>
-                  <w:pPr>
-                    <w:pStyle w:val="Compact"/>
-                    <w:jc w:val="left"/>
-                    <w:jc w:val="center"/>
-                  </w:pPr>
-                  <w:r>
-                    <w:t xml:space="preserve">07233206</w:t>
-                  </w:r>
-                </w:p>
-              </w:tc>
-              <w:tc>
-                <w:tcPr/>
-                <w:p>
-                  <w:pPr>
-                    <w:pStyle w:val="Compact"/>
-                    <w:jc w:val="left"/>
-                    <w:jc w:val="center"/>
-                  </w:pPr>
-                  <w:r>
-                    <w:t xml:space="preserve">Bongard</w:t>
-                  </w:r>
-                </w:p>
-              </w:tc>
-              <w:tc>
-                <w:tcPr/>
-                <w:p>
-                  <w:pPr>
-                    <w:pStyle w:val="Compact"/>
-                    <w:jc w:val="left"/>
-                    <w:jc w:val="center"/>
-                  </w:pPr>
-                  <w:r>
-                    <w:t xml:space="preserve">Kreisangehörige Gemeinde</w:t>
-                  </w:r>
-                </w:p>
-              </w:tc>
-              <w:tc>
-                <w:tcPr/>
-                <w:p>
-                  <w:pPr>
-                    <w:pStyle w:val="Compact"/>
-                    <w:jc w:val="right"/>
-                    <w:jc w:val="center"/>
-                  </w:pPr>
-                  <w:r>
-                    <w:t xml:space="preserve">242</w:t>
-                  </w:r>
-                </w:p>
-              </w:tc>
-              <w:tc>
-                <w:tcPr/>
-                <w:p>
-                  <w:pPr>
-                    <w:pStyle w:val="Compact"/>
-                    <w:jc w:val="right"/>
-                    <w:jc w:val="center"/>
-                  </w:pPr>
-                  <w:r>
-                    <w:t xml:space="preserve">666</w:t>
-                  </w:r>
-                </w:p>
-              </w:tc>
-            </w:tr>
-            <w:tr>
-              <w:tc>
-                <w:tcPr/>
-                <w:p>
-                  <w:pPr>
-                    <w:pStyle w:val="Compact"/>
-                    <w:jc w:val="left"/>
-                    <w:jc w:val="center"/>
-                  </w:pPr>
-                  <w:r>
-                    <w:t xml:space="preserve">14523160</w:t>
-                  </w:r>
-                </w:p>
-              </w:tc>
-              <w:tc>
-                <w:tcPr/>
-                <w:p>
-                  <w:pPr>
-                    <w:pStyle w:val="Compact"/>
-                    <w:jc w:val="left"/>
-                    <w:jc w:val="center"/>
-                  </w:pPr>
-                  <w:r>
-                    <w:t xml:space="preserve">Klingenthal, Stadt</w:t>
-                  </w:r>
-                </w:p>
-              </w:tc>
-              <w:tc>
-                <w:tcPr/>
-                <w:p>
-                  <w:pPr>
-                    <w:pStyle w:val="Compact"/>
-                    <w:jc w:val="left"/>
-                    <w:jc w:val="center"/>
-                  </w:pPr>
-                  <w:r>
-                    <w:t xml:space="preserve">Stadt</w:t>
-                  </w:r>
-                </w:p>
-              </w:tc>
-              <w:tc>
-                <w:tcPr/>
-                <w:p>
-                  <w:pPr>
-                    <w:pStyle w:val="Compact"/>
-                    <w:jc w:val="right"/>
-                    <w:jc w:val="center"/>
-                  </w:pPr>
-                  <w:r>
-                    <w:t xml:space="preserve">7764</w:t>
-                  </w:r>
-                </w:p>
-              </w:tc>
-              <w:tc>
-                <w:tcPr/>
-                <w:p>
-                  <w:pPr>
-                    <w:pStyle w:val="Compact"/>
-                    <w:jc w:val="right"/>
-                    <w:jc w:val="center"/>
-                  </w:pPr>
-                  <w:r>
-                    <w:t xml:space="preserve">5044</w:t>
-                  </w:r>
-                </w:p>
-              </w:tc>
-            </w:tr>
-            <w:tr>
-              <w:tc>
-                <w:tcPr/>
-                <w:p>
-                  <w:pPr>
-                    <w:pStyle w:val="Compact"/>
-                    <w:jc w:val="left"/>
-                    <w:jc w:val="center"/>
-                  </w:pPr>
-                  <w:r>
-                    <w:t xml:space="preserve">07333031</w:t>
-                  </w:r>
-                </w:p>
-              </w:tc>
-              <w:tc>
-                <w:tcPr/>
-                <w:p>
-                  <w:pPr>
-                    <w:pStyle w:val="Compact"/>
-                    <w:jc w:val="left"/>
-                    <w:jc w:val="center"/>
-                  </w:pPr>
-                  <w:r>
-                    <w:t xml:space="preserve">Ilbesheim</w:t>
-                  </w:r>
-                </w:p>
-              </w:tc>
-              <w:tc>
-                <w:tcPr/>
-                <w:p>
-                  <w:pPr>
-                    <w:pStyle w:val="Compact"/>
-                    <w:jc w:val="left"/>
-                    <w:jc w:val="center"/>
-                  </w:pPr>
-                  <w:r>
-                    <w:t xml:space="preserve">Kreisangehörige Gemeinde</w:t>
-                  </w:r>
-                </w:p>
-              </w:tc>
-              <w:tc>
-                <w:tcPr/>
-                <w:p>
-                  <w:pPr>
-                    <w:pStyle w:val="Compact"/>
-                    <w:jc w:val="right"/>
-                    <w:jc w:val="center"/>
-                  </w:pPr>
-                  <w:r>
-                    <w:t xml:space="preserve">609</w:t>
-                  </w:r>
-                </w:p>
-              </w:tc>
-              <w:tc>
-                <w:tcPr/>
-                <w:p>
-                  <w:pPr>
-                    <w:pStyle w:val="Compact"/>
-                    <w:jc w:val="right"/>
-                    <w:jc w:val="center"/>
-                  </w:pPr>
-                  <w:r>
-                    <w:t xml:space="preserve">611</w:t>
-                  </w:r>
-                </w:p>
-              </w:tc>
-            </w:tr>
-            <w:tr>
-              <w:tc>
-                <w:tcPr/>
-                <w:p>
-                  <w:pPr>
-                    <w:pStyle w:val="Compact"/>
-                    <w:jc w:val="left"/>
-                    <w:jc w:val="center"/>
-                  </w:pPr>
-                  <w:r>
-                    <w:t xml:space="preserve">05770044</w:t>
-                  </w:r>
-                </w:p>
-              </w:tc>
-              <w:tc>
-                <w:tcPr/>
-                <w:p>
-                  <w:pPr>
-                    <w:pStyle w:val="Compact"/>
-                    <w:jc w:val="left"/>
-                    <w:jc w:val="center"/>
-                  </w:pPr>
-                  <w:r>
-                    <w:t xml:space="preserve">Stemwede</w:t>
-                  </w:r>
-                </w:p>
-              </w:tc>
-              <w:tc>
-                <w:tcPr/>
-                <w:p>
-                  <w:pPr>
-                    <w:pStyle w:val="Compact"/>
-                    <w:jc w:val="left"/>
-                    <w:jc w:val="center"/>
-                  </w:pPr>
-                  <w:r>
-                    <w:t xml:space="preserve">Kreisangehörige Gemeinde</w:t>
-                  </w:r>
-                </w:p>
-              </w:tc>
-              <w:tc>
-                <w:tcPr/>
-                <w:p>
-                  <w:pPr>
-                    <w:pStyle w:val="Compact"/>
-                    <w:jc w:val="right"/>
-                    <w:jc w:val="center"/>
-                  </w:pPr>
-                  <w:r>
-                    <w:t xml:space="preserve">13311</w:t>
-                  </w:r>
-                </w:p>
-              </w:tc>
-              <w:tc>
-                <w:tcPr/>
-                <w:p>
-                  <w:pPr>
-                    <w:pStyle w:val="Compact"/>
-                    <w:jc w:val="right"/>
-                    <w:jc w:val="center"/>
-                  </w:pPr>
-                  <w:r>
-                    <w:t xml:space="preserve">16613</w:t>
-                  </w:r>
-                </w:p>
-              </w:tc>
-            </w:tr>
-          </w:tbl>
-          <w:bookmarkEnd w:id="25"/>
-          <w:p/>
-        </w:tc>
-      </w:tr>
-    </w:tbl>
-    <w:p>
-      <w:pPr>
-        <w:pStyle w:val="BodyText"/>
       </w:pPr>
       <w:r>
         <w:t xml:space="preserve">Die so gewonnenen Gemeindedaten werden nun an die Expositionsdaten angehängt. Für den Teil, in dem schon die Gemeindekennziffer existiert ist dies einfach</w:t>
@@ -3616,14 +4025,14 @@
         <w:t xml:space="preserve"># ℹ 1 variable: name_stadt_gemeinde &lt;chr&gt;</w:t>
       </w:r>
     </w:p>
-    <w:bookmarkEnd w:id="26"/>
-    <w:bookmarkStart w:id="28" w:name="statistische-übersicht"/>
+    <w:bookmarkEnd w:id="17"/>
+    <w:bookmarkStart w:id="19" w:name="statistische-übersicht-deutsche-daten"/>
     <w:p>
       <w:pPr>
-        <w:pStyle w:val="Heading2"/>
+        <w:pStyle w:val="Heading3"/>
       </w:pPr>
       <w:r>
-        <w:t xml:space="preserve">Statistische Übersicht</w:t>
+        <w:t xml:space="preserve">Statistische Übersicht deutsche Daten</w:t>
       </w:r>
     </w:p>
     <w:p>
@@ -3631,7 +4040,7 @@
         <w:pStyle w:val="FirstParagraph"/>
       </w:pPr>
       <w:r>
-        <w:t xml:space="preserve">Bisher eingelesen wurden die in</w:t>
+        <w:t xml:space="preserve">An deutschen Daten wurden bisher die in</w:t>
       </w:r>
       <w:r>
         <w:t xml:space="preserve"> </w:t>
@@ -3641,14 +4050,14 @@
           <w:rPr>
             <w:rStyle w:val="Hyperlink"/>
           </w:rPr>
-          <w:t xml:space="preserve">Table 3</w:t>
+          <w:t xml:space="preserve">Table 2</w:t>
         </w:r>
       </w:hyperlink>
       <w:r>
         <w:t xml:space="preserve"> </w:t>
       </w:r>
       <w:r>
-        <w:t xml:space="preserve">zusammengefassten Expositionsdaten</w:t>
+        <w:t xml:space="preserve">zusammengefassten Expositionsdaten eingelesen.</w:t>
       </w:r>
     </w:p>
     <w:tbl>
@@ -3664,7 +4073,7 @@
       <w:tr>
         <w:tc>
           <w:tcPr/>
-          <w:bookmarkStart w:id="27" w:name="tbl-expositionsstatistik"/>
+          <w:bookmarkStart w:id="18" w:name="tbl-expositionsstatistik"/>
           <w:p>
             <w:pPr>
               <w:jc w:val="center"/>
@@ -3675,7 +4084,7 @@
               <w:pStyle w:val="ImageCaption"/>
             </w:pPr>
             <w:r>
-              <w:t xml:space="preserve">Table 3: Deskriptive Auswertung der bisher eingelesenen Expositionsdaten</w:t>
+              <w:t xml:space="preserve">Table 2: Deskriptive Auswertung der bisher eingelesenen Expositionsdaten</w:t>
             </w:r>
           </w:p>
           <w:tbl>
@@ -3894,20 +4303,20 @@
                     <w:jc w:val="center"/>
                   </w:pPr>
                   <w:r>
-                    <w:t xml:space="preserve">1658130</w:t>
-                  </w:r>
-                </w:p>
-              </w:tc>
-              <w:tc>
-                <w:tcPr/>
-                <w:p>
-                  <w:pPr>
-                    <w:pStyle w:val="Compact"/>
-                    <w:jc w:val="right"/>
-                    <w:jc w:val="center"/>
-                  </w:pPr>
-                  <w:r>
-                    <w:t xml:space="preserve">4733230</w:t>
+                    <w:t xml:space="preserve">1628008</w:t>
+                  </w:r>
+                </w:p>
+              </w:tc>
+              <w:tc>
+                <w:tcPr/>
+                <w:p>
+                  <w:pPr>
+                    <w:pStyle w:val="Compact"/>
+                    <w:jc w:val="right"/>
+                    <w:jc w:val="center"/>
+                  </w:pPr>
+                  <w:r>
+                    <w:t xml:space="preserve">4667009</w:t>
                   </w:r>
                 </w:p>
               </w:tc>
@@ -4026,20 +4435,20 @@
                     <w:jc w:val="center"/>
                   </w:pPr>
                   <w:r>
-                    <w:t xml:space="preserve">1658130</w:t>
-                  </w:r>
-                </w:p>
-              </w:tc>
-              <w:tc>
-                <w:tcPr/>
-                <w:p>
-                  <w:pPr>
-                    <w:pStyle w:val="Compact"/>
-                    <w:jc w:val="right"/>
-                    <w:jc w:val="center"/>
-                  </w:pPr>
-                  <w:r>
-                    <w:t xml:space="preserve">4733230</w:t>
+                    <w:t xml:space="preserve">1628008</w:t>
+                  </w:r>
+                </w:p>
+              </w:tc>
+              <w:tc>
+                <w:tcPr/>
+                <w:p>
+                  <w:pPr>
+                    <w:pStyle w:val="Compact"/>
+                    <w:jc w:val="right"/>
+                    <w:jc w:val="center"/>
+                  </w:pPr>
+                  <w:r>
+                    <w:t xml:space="preserve">4667009</w:t>
                   </w:r>
                 </w:p>
               </w:tc>
@@ -4171,7 +4580,7 @@
                     <w:jc w:val="center"/>
                   </w:pPr>
                   <w:r>
-                    <w:t xml:space="preserve">2060291</w:t>
+                    <w:t xml:space="preserve">2025421</w:t>
                   </w:r>
                 </w:p>
               </w:tc>
@@ -4303,7 +4712,7 @@
                     <w:jc w:val="center"/>
                   </w:pPr>
                   <w:r>
-                    <w:t xml:space="preserve">2060291</w:t>
+                    <w:t xml:space="preserve">2025421</w:t>
                   </w:r>
                 </w:p>
               </w:tc>
@@ -4435,7 +4844,7 @@
                     <w:jc w:val="center"/>
                   </w:pPr>
                   <w:r>
-                    <w:t xml:space="preserve">1658130</w:t>
+                    <w:t xml:space="preserve">1628008</w:t>
                   </w:r>
                 </w:p>
               </w:tc>
@@ -4567,7 +4976,7 @@
                     <w:jc w:val="center"/>
                   </w:pPr>
                   <w:r>
-                    <w:t xml:space="preserve">1658130</w:t>
+                    <w:t xml:space="preserve">1628008</w:t>
                   </w:r>
                 </w:p>
               </w:tc>
@@ -4699,7 +5108,7 @@
                     <w:jc w:val="center"/>
                   </w:pPr>
                   <w:r>
-                    <w:t xml:space="preserve">8248390</w:t>
+                    <w:t xml:space="preserve">8131748</w:t>
                   </w:r>
                 </w:p>
               </w:tc>
@@ -4831,7 +5240,7 @@
                     <w:jc w:val="center"/>
                   </w:pPr>
                   <w:r>
-                    <w:t xml:space="preserve">8248390</w:t>
+                    <w:t xml:space="preserve">8131748</w:t>
                   </w:r>
                 </w:p>
               </w:tc>
@@ -4963,7 +5372,7 @@
                     <w:jc w:val="center"/>
                   </w:pPr>
                   <w:r>
-                    <w:t xml:space="preserve">902104</w:t>
+                    <w:t xml:space="preserve">891726</w:t>
                   </w:r>
                 </w:p>
               </w:tc>
@@ -5095,7 +5504,7 @@
                     <w:jc w:val="center"/>
                   </w:pPr>
                   <w:r>
-                    <w:t xml:space="preserve">902104</w:t>
+                    <w:t xml:space="preserve">891726</w:t>
                   </w:r>
                 </w:p>
               </w:tc>
@@ -5227,7 +5636,7 @@
                     <w:jc w:val="center"/>
                   </w:pPr>
                   <w:r>
-                    <w:t xml:space="preserve">5884908</w:t>
+                    <w:t xml:space="preserve">5804498</w:t>
                   </w:r>
                 </w:p>
               </w:tc>
@@ -5359,7 +5768,7 @@
                     <w:jc w:val="center"/>
                   </w:pPr>
                   <w:r>
-                    <w:t xml:space="preserve">5884908</w:t>
+                    <w:t xml:space="preserve">5804498</w:t>
                   </w:r>
                 </w:p>
               </w:tc>
@@ -5478,20 +5887,20 @@
                     <w:jc w:val="center"/>
                   </w:pPr>
                   <w:r>
-                    <w:t xml:space="preserve">465812</w:t>
-                  </w:r>
-                </w:p>
-              </w:tc>
-              <w:tc>
-                <w:tcPr/>
-                <w:p>
-                  <w:pPr>
-                    <w:pStyle w:val="Compact"/>
-                    <w:jc w:val="right"/>
-                    <w:jc w:val="center"/>
-                  </w:pPr>
-                  <w:r>
-                    <w:t xml:space="preserve">465812</w:t>
+                    <w:t xml:space="preserve">462520</w:t>
+                  </w:r>
+                </w:p>
+              </w:tc>
+              <w:tc>
+                <w:tcPr/>
+                <w:p>
+                  <w:pPr>
+                    <w:pStyle w:val="Compact"/>
+                    <w:jc w:val="right"/>
+                    <w:jc w:val="center"/>
+                  </w:pPr>
+                  <w:r>
+                    <w:t xml:space="preserve">462520</w:t>
                   </w:r>
                 </w:p>
               </w:tc>
@@ -5610,20 +6019,20 @@
                     <w:jc w:val="center"/>
                   </w:pPr>
                   <w:r>
-                    <w:t xml:space="preserve">465812</w:t>
-                  </w:r>
-                </w:p>
-              </w:tc>
-              <w:tc>
-                <w:tcPr/>
-                <w:p>
-                  <w:pPr>
-                    <w:pStyle w:val="Compact"/>
-                    <w:jc w:val="right"/>
-                    <w:jc w:val="center"/>
-                  </w:pPr>
-                  <w:r>
-                    <w:t xml:space="preserve">465812</w:t>
+                    <w:t xml:space="preserve">462520</w:t>
+                  </w:r>
+                </w:p>
+              </w:tc>
+              <w:tc>
+                <w:tcPr/>
+                <w:p>
+                  <w:pPr>
+                    <w:pStyle w:val="Compact"/>
+                    <w:jc w:val="right"/>
+                    <w:jc w:val="center"/>
+                  </w:pPr>
+                  <w:r>
+                    <w:t xml:space="preserve">462520</w:t>
                   </w:r>
                 </w:p>
               </w:tc>
@@ -5742,20 +6151,20 @@
                     <w:jc w:val="center"/>
                   </w:pPr>
                   <w:r>
-                    <w:t xml:space="preserve">465812</w:t>
-                  </w:r>
-                </w:p>
-              </w:tc>
-              <w:tc>
-                <w:tcPr/>
-                <w:p>
-                  <w:pPr>
-                    <w:pStyle w:val="Compact"/>
-                    <w:jc w:val="right"/>
-                    <w:jc w:val="center"/>
-                  </w:pPr>
-                  <w:r>
-                    <w:t xml:space="preserve">465812</w:t>
+                    <w:t xml:space="preserve">462520</w:t>
+                  </w:r>
+                </w:p>
+              </w:tc>
+              <w:tc>
+                <w:tcPr/>
+                <w:p>
+                  <w:pPr>
+                    <w:pStyle w:val="Compact"/>
+                    <w:jc w:val="right"/>
+                    <w:jc w:val="center"/>
+                  </w:pPr>
+                  <w:r>
+                    <w:t xml:space="preserve">462520</w:t>
                   </w:r>
                 </w:p>
               </w:tc>
@@ -5874,20 +6283,20 @@
                     <w:jc w:val="center"/>
                   </w:pPr>
                   <w:r>
-                    <w:t xml:space="preserve">465812</w:t>
-                  </w:r>
-                </w:p>
-              </w:tc>
-              <w:tc>
-                <w:tcPr/>
-                <w:p>
-                  <w:pPr>
-                    <w:pStyle w:val="Compact"/>
-                    <w:jc w:val="right"/>
-                    <w:jc w:val="center"/>
-                  </w:pPr>
-                  <w:r>
-                    <w:t xml:space="preserve">465812</w:t>
+                    <w:t xml:space="preserve">462520</w:t>
+                  </w:r>
+                </w:p>
+              </w:tc>
+              <w:tc>
+                <w:tcPr/>
+                <w:p>
+                  <w:pPr>
+                    <w:pStyle w:val="Compact"/>
+                    <w:jc w:val="right"/>
+                    <w:jc w:val="center"/>
+                  </w:pPr>
+                  <w:r>
+                    <w:t xml:space="preserve">462520</w:t>
                   </w:r>
                 </w:p>
               </w:tc>
@@ -6006,20 +6415,20 @@
                     <w:jc w:val="center"/>
                   </w:pPr>
                   <w:r>
-                    <w:t xml:space="preserve">465812</w:t>
-                  </w:r>
-                </w:p>
-              </w:tc>
-              <w:tc>
-                <w:tcPr/>
-                <w:p>
-                  <w:pPr>
-                    <w:pStyle w:val="Compact"/>
-                    <w:jc w:val="right"/>
-                    <w:jc w:val="center"/>
-                  </w:pPr>
-                  <w:r>
-                    <w:t xml:space="preserve">465812</w:t>
+                    <w:t xml:space="preserve">462520</w:t>
+                  </w:r>
+                </w:p>
+              </w:tc>
+              <w:tc>
+                <w:tcPr/>
+                <w:p>
+                  <w:pPr>
+                    <w:pStyle w:val="Compact"/>
+                    <w:jc w:val="right"/>
+                    <w:jc w:val="center"/>
+                  </w:pPr>
+                  <w:r>
+                    <w:t xml:space="preserve">462520</w:t>
                   </w:r>
                 </w:p>
               </w:tc>
@@ -6138,20 +6547,20 @@
                     <w:jc w:val="center"/>
                   </w:pPr>
                   <w:r>
-                    <w:t xml:space="preserve">465812</w:t>
-                  </w:r>
-                </w:p>
-              </w:tc>
-              <w:tc>
-                <w:tcPr/>
-                <w:p>
-                  <w:pPr>
-                    <w:pStyle w:val="Compact"/>
-                    <w:jc w:val="right"/>
-                    <w:jc w:val="center"/>
-                  </w:pPr>
-                  <w:r>
-                    <w:t xml:space="preserve">465812</w:t>
+                    <w:t xml:space="preserve">462520</w:t>
+                  </w:r>
+                </w:p>
+              </w:tc>
+              <w:tc>
+                <w:tcPr/>
+                <w:p>
+                  <w:pPr>
+                    <w:pStyle w:val="Compact"/>
+                    <w:jc w:val="right"/>
+                    <w:jc w:val="center"/>
+                  </w:pPr>
+                  <w:r>
+                    <w:t xml:space="preserve">462520</w:t>
                   </w:r>
                 </w:p>
               </w:tc>
@@ -6270,20 +6679,20 @@
                     <w:jc w:val="center"/>
                   </w:pPr>
                   <w:r>
-                    <w:t xml:space="preserve">1892122</w:t>
-                  </w:r>
-                </w:p>
-              </w:tc>
-              <w:tc>
-                <w:tcPr/>
-                <w:p>
-                  <w:pPr>
-                    <w:pStyle w:val="Compact"/>
-                    <w:jc w:val="right"/>
-                    <w:jc w:val="center"/>
-                  </w:pPr>
-                  <w:r>
-                    <w:t xml:space="preserve">1892122</w:t>
+                    <w:t xml:space="preserve">1853935</w:t>
+                  </w:r>
+                </w:p>
+              </w:tc>
+              <w:tc>
+                <w:tcPr/>
+                <w:p>
+                  <w:pPr>
+                    <w:pStyle w:val="Compact"/>
+                    <w:jc w:val="right"/>
+                    <w:jc w:val="center"/>
+                  </w:pPr>
+                  <w:r>
+                    <w:t xml:space="preserve">1853935</w:t>
                   </w:r>
                 </w:p>
               </w:tc>
@@ -6402,20 +6811,20 @@
                     <w:jc w:val="center"/>
                   </w:pPr>
                   <w:r>
-                    <w:t xml:space="preserve">1892122</w:t>
-                  </w:r>
-                </w:p>
-              </w:tc>
-              <w:tc>
-                <w:tcPr/>
-                <w:p>
-                  <w:pPr>
-                    <w:pStyle w:val="Compact"/>
-                    <w:jc w:val="right"/>
-                    <w:jc w:val="center"/>
-                  </w:pPr>
-                  <w:r>
-                    <w:t xml:space="preserve">1892122</w:t>
+                    <w:t xml:space="preserve">1853935</w:t>
+                  </w:r>
+                </w:p>
+              </w:tc>
+              <w:tc>
+                <w:tcPr/>
+                <w:p>
+                  <w:pPr>
+                    <w:pStyle w:val="Compact"/>
+                    <w:jc w:val="right"/>
+                    <w:jc w:val="center"/>
+                  </w:pPr>
+                  <w:r>
+                    <w:t xml:space="preserve">1853935</w:t>
                   </w:r>
                 </w:p>
               </w:tc>
@@ -6534,20 +6943,20 @@
                     <w:jc w:val="center"/>
                   </w:pPr>
                   <w:r>
-                    <w:t xml:space="preserve">1892122</w:t>
-                  </w:r>
-                </w:p>
-              </w:tc>
-              <w:tc>
-                <w:tcPr/>
-                <w:p>
-                  <w:pPr>
-                    <w:pStyle w:val="Compact"/>
-                    <w:jc w:val="right"/>
-                    <w:jc w:val="center"/>
-                  </w:pPr>
-                  <w:r>
-                    <w:t xml:space="preserve">1892122</w:t>
+                    <w:t xml:space="preserve">1853935</w:t>
+                  </w:r>
+                </w:p>
+              </w:tc>
+              <w:tc>
+                <w:tcPr/>
+                <w:p>
+                  <w:pPr>
+                    <w:pStyle w:val="Compact"/>
+                    <w:jc w:val="right"/>
+                    <w:jc w:val="center"/>
+                  </w:pPr>
+                  <w:r>
+                    <w:t xml:space="preserve">1853935</w:t>
                   </w:r>
                 </w:p>
               </w:tc>
@@ -6666,20 +7075,20 @@
                     <w:jc w:val="center"/>
                   </w:pPr>
                   <w:r>
-                    <w:t xml:space="preserve">1892122</w:t>
-                  </w:r>
-                </w:p>
-              </w:tc>
-              <w:tc>
-                <w:tcPr/>
-                <w:p>
-                  <w:pPr>
-                    <w:pStyle w:val="Compact"/>
-                    <w:jc w:val="right"/>
-                    <w:jc w:val="center"/>
-                  </w:pPr>
-                  <w:r>
-                    <w:t xml:space="preserve">1892122</w:t>
+                    <w:t xml:space="preserve">1853935</w:t>
+                  </w:r>
+                </w:p>
+              </w:tc>
+              <w:tc>
+                <w:tcPr/>
+                <w:p>
+                  <w:pPr>
+                    <w:pStyle w:val="Compact"/>
+                    <w:jc w:val="right"/>
+                    <w:jc w:val="center"/>
+                  </w:pPr>
+                  <w:r>
+                    <w:t xml:space="preserve">1853935</w:t>
                   </w:r>
                 </w:p>
               </w:tc>
@@ -6798,20 +7207,20 @@
                     <w:jc w:val="center"/>
                   </w:pPr>
                   <w:r>
-                    <w:t xml:space="preserve">1892122</w:t>
-                  </w:r>
-                </w:p>
-              </w:tc>
-              <w:tc>
-                <w:tcPr/>
-                <w:p>
-                  <w:pPr>
-                    <w:pStyle w:val="Compact"/>
-                    <w:jc w:val="right"/>
-                    <w:jc w:val="center"/>
-                  </w:pPr>
-                  <w:r>
-                    <w:t xml:space="preserve">1892122</w:t>
+                    <w:t xml:space="preserve">1853935</w:t>
+                  </w:r>
+                </w:p>
+              </w:tc>
+              <w:tc>
+                <w:tcPr/>
+                <w:p>
+                  <w:pPr>
+                    <w:pStyle w:val="Compact"/>
+                    <w:jc w:val="right"/>
+                    <w:jc w:val="center"/>
+                  </w:pPr>
+                  <w:r>
+                    <w:t xml:space="preserve">1853935</w:t>
                   </w:r>
                 </w:p>
               </w:tc>
@@ -6930,20 +7339,20 @@
                     <w:jc w:val="center"/>
                   </w:pPr>
                   <w:r>
-                    <w:t xml:space="preserve">1892122</w:t>
-                  </w:r>
-                </w:p>
-              </w:tc>
-              <w:tc>
-                <w:tcPr/>
-                <w:p>
-                  <w:pPr>
-                    <w:pStyle w:val="Compact"/>
-                    <w:jc w:val="right"/>
-                    <w:jc w:val="center"/>
-                  </w:pPr>
-                  <w:r>
-                    <w:t xml:space="preserve">1892122</w:t>
+                    <w:t xml:space="preserve">1853935</w:t>
+                  </w:r>
+                </w:p>
+              </w:tc>
+              <w:tc>
+                <w:tcPr/>
+                <w:p>
+                  <w:pPr>
+                    <w:pStyle w:val="Compact"/>
+                    <w:jc w:val="right"/>
+                    <w:jc w:val="center"/>
+                  </w:pPr>
+                  <w:r>
+                    <w:t xml:space="preserve">1853935</w:t>
                   </w:r>
                 </w:p>
               </w:tc>
@@ -7062,20 +7471,20 @@
                     <w:jc w:val="center"/>
                   </w:pPr>
                   <w:r>
-                    <w:t xml:space="preserve">1357849</w:t>
-                  </w:r>
-                </w:p>
-              </w:tc>
-              <w:tc>
-                <w:tcPr/>
-                <w:p>
-                  <w:pPr>
-                    <w:pStyle w:val="Compact"/>
-                    <w:jc w:val="right"/>
-                    <w:jc w:val="center"/>
-                  </w:pPr>
-                  <w:r>
-                    <w:t xml:space="preserve">1357849</w:t>
+                    <w:t xml:space="preserve">1337054</w:t>
+                  </w:r>
+                </w:p>
+              </w:tc>
+              <w:tc>
+                <w:tcPr/>
+                <w:p>
+                  <w:pPr>
+                    <w:pStyle w:val="Compact"/>
+                    <w:jc w:val="right"/>
+                    <w:jc w:val="center"/>
+                  </w:pPr>
+                  <w:r>
+                    <w:t xml:space="preserve">1337054</w:t>
                   </w:r>
                 </w:p>
               </w:tc>
@@ -7194,20 +7603,20 @@
                     <w:jc w:val="center"/>
                   </w:pPr>
                   <w:r>
-                    <w:t xml:space="preserve">1357849</w:t>
-                  </w:r>
-                </w:p>
-              </w:tc>
-              <w:tc>
-                <w:tcPr/>
-                <w:p>
-                  <w:pPr>
-                    <w:pStyle w:val="Compact"/>
-                    <w:jc w:val="right"/>
-                    <w:jc w:val="center"/>
-                  </w:pPr>
-                  <w:r>
-                    <w:t xml:space="preserve">1357849</w:t>
+                    <w:t xml:space="preserve">1337054</w:t>
+                  </w:r>
+                </w:p>
+              </w:tc>
+              <w:tc>
+                <w:tcPr/>
+                <w:p>
+                  <w:pPr>
+                    <w:pStyle w:val="Compact"/>
+                    <w:jc w:val="right"/>
+                    <w:jc w:val="center"/>
+                  </w:pPr>
+                  <w:r>
+                    <w:t xml:space="preserve">1337054</w:t>
                   </w:r>
                 </w:p>
               </w:tc>
@@ -7326,20 +7735,20 @@
                     <w:jc w:val="center"/>
                   </w:pPr>
                   <w:r>
-                    <w:t xml:space="preserve">1357849</w:t>
-                  </w:r>
-                </w:p>
-              </w:tc>
-              <w:tc>
-                <w:tcPr/>
-                <w:p>
-                  <w:pPr>
-                    <w:pStyle w:val="Compact"/>
-                    <w:jc w:val="right"/>
-                    <w:jc w:val="center"/>
-                  </w:pPr>
-                  <w:r>
-                    <w:t xml:space="preserve">1357849</w:t>
+                    <w:t xml:space="preserve">1337054</w:t>
+                  </w:r>
+                </w:p>
+              </w:tc>
+              <w:tc>
+                <w:tcPr/>
+                <w:p>
+                  <w:pPr>
+                    <w:pStyle w:val="Compact"/>
+                    <w:jc w:val="right"/>
+                    <w:jc w:val="center"/>
+                  </w:pPr>
+                  <w:r>
+                    <w:t xml:space="preserve">1337054</w:t>
                   </w:r>
                 </w:p>
               </w:tc>
@@ -7458,20 +7867,20 @@
                     <w:jc w:val="center"/>
                   </w:pPr>
                   <w:r>
-                    <w:t xml:space="preserve">1357849</w:t>
-                  </w:r>
-                </w:p>
-              </w:tc>
-              <w:tc>
-                <w:tcPr/>
-                <w:p>
-                  <w:pPr>
-                    <w:pStyle w:val="Compact"/>
-                    <w:jc w:val="right"/>
-                    <w:jc w:val="center"/>
-                  </w:pPr>
-                  <w:r>
-                    <w:t xml:space="preserve">1357849</w:t>
+                    <w:t xml:space="preserve">1337054</w:t>
+                  </w:r>
+                </w:p>
+              </w:tc>
+              <w:tc>
+                <w:tcPr/>
+                <w:p>
+                  <w:pPr>
+                    <w:pStyle w:val="Compact"/>
+                    <w:jc w:val="right"/>
+                    <w:jc w:val="center"/>
+                  </w:pPr>
+                  <w:r>
+                    <w:t xml:space="preserve">1337054</w:t>
                   </w:r>
                 </w:p>
               </w:tc>
@@ -7590,20 +7999,20 @@
                     <w:jc w:val="center"/>
                   </w:pPr>
                   <w:r>
-                    <w:t xml:space="preserve">1357849</w:t>
-                  </w:r>
-                </w:p>
-              </w:tc>
-              <w:tc>
-                <w:tcPr/>
-                <w:p>
-                  <w:pPr>
-                    <w:pStyle w:val="Compact"/>
-                    <w:jc w:val="right"/>
-                    <w:jc w:val="center"/>
-                  </w:pPr>
-                  <w:r>
-                    <w:t xml:space="preserve">1357849</w:t>
+                    <w:t xml:space="preserve">1337054</w:t>
+                  </w:r>
+                </w:p>
+              </w:tc>
+              <w:tc>
+                <w:tcPr/>
+                <w:p>
+                  <w:pPr>
+                    <w:pStyle w:val="Compact"/>
+                    <w:jc w:val="right"/>
+                    <w:jc w:val="center"/>
+                  </w:pPr>
+                  <w:r>
+                    <w:t xml:space="preserve">1337054</w:t>
                   </w:r>
                 </w:p>
               </w:tc>
@@ -7722,20 +8131,20 @@
                     <w:jc w:val="center"/>
                   </w:pPr>
                   <w:r>
-                    <w:t xml:space="preserve">1357849</w:t>
-                  </w:r>
-                </w:p>
-              </w:tc>
-              <w:tc>
-                <w:tcPr/>
-                <w:p>
-                  <w:pPr>
-                    <w:pStyle w:val="Compact"/>
-                    <w:jc w:val="right"/>
-                    <w:jc w:val="center"/>
-                  </w:pPr>
-                  <w:r>
-                    <w:t xml:space="preserve">1357849</w:t>
+                    <w:t xml:space="preserve">1337054</w:t>
+                  </w:r>
+                </w:p>
+              </w:tc>
+              <w:tc>
+                <w:tcPr/>
+                <w:p>
+                  <w:pPr>
+                    <w:pStyle w:val="Compact"/>
+                    <w:jc w:val="right"/>
+                    <w:jc w:val="center"/>
+                  </w:pPr>
+                  <w:r>
+                    <w:t xml:space="preserve">1337054</w:t>
                   </w:r>
                 </w:p>
               </w:tc>
@@ -7854,20 +8263,20 @@
                     <w:jc w:val="center"/>
                   </w:pPr>
                   <w:r>
-                    <w:t xml:space="preserve">684864</w:t>
-                  </w:r>
-                </w:p>
-              </w:tc>
-              <w:tc>
-                <w:tcPr/>
-                <w:p>
-                  <w:pPr>
-                    <w:pStyle w:val="Compact"/>
-                    <w:jc w:val="right"/>
-                    <w:jc w:val="center"/>
-                  </w:pPr>
-                  <w:r>
-                    <w:t xml:space="preserve">684864</w:t>
+                    <w:t xml:space="preserve">676463</w:t>
+                  </w:r>
+                </w:p>
+              </w:tc>
+              <w:tc>
+                <w:tcPr/>
+                <w:p>
+                  <w:pPr>
+                    <w:pStyle w:val="Compact"/>
+                    <w:jc w:val="right"/>
+                    <w:jc w:val="center"/>
+                  </w:pPr>
+                  <w:r>
+                    <w:t xml:space="preserve">676463</w:t>
                   </w:r>
                 </w:p>
               </w:tc>
@@ -7986,20 +8395,20 @@
                     <w:jc w:val="center"/>
                   </w:pPr>
                   <w:r>
-                    <w:t xml:space="preserve">684864</w:t>
-                  </w:r>
-                </w:p>
-              </w:tc>
-              <w:tc>
-                <w:tcPr/>
-                <w:p>
-                  <w:pPr>
-                    <w:pStyle w:val="Compact"/>
-                    <w:jc w:val="right"/>
-                    <w:jc w:val="center"/>
-                  </w:pPr>
-                  <w:r>
-                    <w:t xml:space="preserve">684864</w:t>
+                    <w:t xml:space="preserve">676463</w:t>
+                  </w:r>
+                </w:p>
+              </w:tc>
+              <w:tc>
+                <w:tcPr/>
+                <w:p>
+                  <w:pPr>
+                    <w:pStyle w:val="Compact"/>
+                    <w:jc w:val="right"/>
+                    <w:jc w:val="center"/>
+                  </w:pPr>
+                  <w:r>
+                    <w:t xml:space="preserve">676463</w:t>
                   </w:r>
                 </w:p>
               </w:tc>
@@ -8118,20 +8527,20 @@
                     <w:jc w:val="center"/>
                   </w:pPr>
                   <w:r>
-                    <w:t xml:space="preserve">684864</w:t>
-                  </w:r>
-                </w:p>
-              </w:tc>
-              <w:tc>
-                <w:tcPr/>
-                <w:p>
-                  <w:pPr>
-                    <w:pStyle w:val="Compact"/>
-                    <w:jc w:val="right"/>
-                    <w:jc w:val="center"/>
-                  </w:pPr>
-                  <w:r>
-                    <w:t xml:space="preserve">684864</w:t>
+                    <w:t xml:space="preserve">676463</w:t>
+                  </w:r>
+                </w:p>
+              </w:tc>
+              <w:tc>
+                <w:tcPr/>
+                <w:p>
+                  <w:pPr>
+                    <w:pStyle w:val="Compact"/>
+                    <w:jc w:val="right"/>
+                    <w:jc w:val="center"/>
+                  </w:pPr>
+                  <w:r>
+                    <w:t xml:space="preserve">676463</w:t>
                   </w:r>
                 </w:p>
               </w:tc>
@@ -8250,20 +8659,20 @@
                     <w:jc w:val="center"/>
                   </w:pPr>
                   <w:r>
-                    <w:t xml:space="preserve">684864</w:t>
-                  </w:r>
-                </w:p>
-              </w:tc>
-              <w:tc>
-                <w:tcPr/>
-                <w:p>
-                  <w:pPr>
-                    <w:pStyle w:val="Compact"/>
-                    <w:jc w:val="right"/>
-                    <w:jc w:val="center"/>
-                  </w:pPr>
-                  <w:r>
-                    <w:t xml:space="preserve">684864</w:t>
+                    <w:t xml:space="preserve">676463</w:t>
+                  </w:r>
+                </w:p>
+              </w:tc>
+              <w:tc>
+                <w:tcPr/>
+                <w:p>
+                  <w:pPr>
+                    <w:pStyle w:val="Compact"/>
+                    <w:jc w:val="right"/>
+                    <w:jc w:val="center"/>
+                  </w:pPr>
+                  <w:r>
+                    <w:t xml:space="preserve">676463</w:t>
                   </w:r>
                 </w:p>
               </w:tc>
@@ -8382,20 +8791,20 @@
                     <w:jc w:val="center"/>
                   </w:pPr>
                   <w:r>
-                    <w:t xml:space="preserve">684864</w:t>
-                  </w:r>
-                </w:p>
-              </w:tc>
-              <w:tc>
-                <w:tcPr/>
-                <w:p>
-                  <w:pPr>
-                    <w:pStyle w:val="Compact"/>
-                    <w:jc w:val="right"/>
-                    <w:jc w:val="center"/>
-                  </w:pPr>
-                  <w:r>
-                    <w:t xml:space="preserve">684864</w:t>
+                    <w:t xml:space="preserve">676463</w:t>
+                  </w:r>
+                </w:p>
+              </w:tc>
+              <w:tc>
+                <w:tcPr/>
+                <w:p>
+                  <w:pPr>
+                    <w:pStyle w:val="Compact"/>
+                    <w:jc w:val="right"/>
+                    <w:jc w:val="center"/>
+                  </w:pPr>
+                  <w:r>
+                    <w:t xml:space="preserve">676463</w:t>
                   </w:r>
                 </w:p>
               </w:tc>
@@ -8514,20 +8923,20 @@
                     <w:jc w:val="center"/>
                   </w:pPr>
                   <w:r>
-                    <w:t xml:space="preserve">684864</w:t>
-                  </w:r>
-                </w:p>
-              </w:tc>
-              <w:tc>
-                <w:tcPr/>
-                <w:p>
-                  <w:pPr>
-                    <w:pStyle w:val="Compact"/>
-                    <w:jc w:val="right"/>
-                    <w:jc w:val="center"/>
-                  </w:pPr>
-                  <w:r>
-                    <w:t xml:space="preserve">684864</w:t>
+                    <w:t xml:space="preserve">676463</w:t>
+                  </w:r>
+                </w:p>
+              </w:tc>
+              <w:tc>
+                <w:tcPr/>
+                <w:p>
+                  <w:pPr>
+                    <w:pStyle w:val="Compact"/>
+                    <w:jc w:val="right"/>
+                    <w:jc w:val="center"/>
+                  </w:pPr>
+                  <w:r>
+                    <w:t xml:space="preserve">676463</w:t>
                   </w:r>
                 </w:p>
               </w:tc>
@@ -8646,20 +9055,20 @@
                     <w:jc w:val="center"/>
                   </w:pPr>
                   <w:r>
-                    <w:t xml:space="preserve">7897742</w:t>
-                  </w:r>
-                </w:p>
-              </w:tc>
-              <w:tc>
-                <w:tcPr/>
-                <w:p>
-                  <w:pPr>
-                    <w:pStyle w:val="Compact"/>
-                    <w:jc w:val="right"/>
-                    <w:jc w:val="center"/>
-                  </w:pPr>
-                  <w:r>
-                    <w:t xml:space="preserve">7897742</w:t>
+                    <w:t xml:space="preserve">7808398</w:t>
+                  </w:r>
+                </w:p>
+              </w:tc>
+              <w:tc>
+                <w:tcPr/>
+                <w:p>
+                  <w:pPr>
+                    <w:pStyle w:val="Compact"/>
+                    <w:jc w:val="right"/>
+                    <w:jc w:val="center"/>
+                  </w:pPr>
+                  <w:r>
+                    <w:t xml:space="preserve">7808398</w:t>
                   </w:r>
                 </w:p>
               </w:tc>
@@ -8778,20 +9187,20 @@
                     <w:jc w:val="center"/>
                   </w:pPr>
                   <w:r>
-                    <w:t xml:space="preserve">7897742</w:t>
-                  </w:r>
-                </w:p>
-              </w:tc>
-              <w:tc>
-                <w:tcPr/>
-                <w:p>
-                  <w:pPr>
-                    <w:pStyle w:val="Compact"/>
-                    <w:jc w:val="right"/>
-                    <w:jc w:val="center"/>
-                  </w:pPr>
-                  <w:r>
-                    <w:t xml:space="preserve">7897742</w:t>
+                    <w:t xml:space="preserve">7808398</w:t>
+                  </w:r>
+                </w:p>
+              </w:tc>
+              <w:tc>
+                <w:tcPr/>
+                <w:p>
+                  <w:pPr>
+                    <w:pStyle w:val="Compact"/>
+                    <w:jc w:val="right"/>
+                    <w:jc w:val="center"/>
+                  </w:pPr>
+                  <w:r>
+                    <w:t xml:space="preserve">7808398</w:t>
                   </w:r>
                 </w:p>
               </w:tc>
@@ -8910,20 +9319,20 @@
                     <w:jc w:val="center"/>
                   </w:pPr>
                   <w:r>
-                    <w:t xml:space="preserve">7897742</w:t>
-                  </w:r>
-                </w:p>
-              </w:tc>
-              <w:tc>
-                <w:tcPr/>
-                <w:p>
-                  <w:pPr>
-                    <w:pStyle w:val="Compact"/>
-                    <w:jc w:val="right"/>
-                    <w:jc w:val="center"/>
-                  </w:pPr>
-                  <w:r>
-                    <w:t xml:space="preserve">7897742</w:t>
+                    <w:t xml:space="preserve">7808398</w:t>
+                  </w:r>
+                </w:p>
+              </w:tc>
+              <w:tc>
+                <w:tcPr/>
+                <w:p>
+                  <w:pPr>
+                    <w:pStyle w:val="Compact"/>
+                    <w:jc w:val="right"/>
+                    <w:jc w:val="center"/>
+                  </w:pPr>
+                  <w:r>
+                    <w:t xml:space="preserve">7808398</w:t>
                   </w:r>
                 </w:p>
               </w:tc>
@@ -9042,20 +9451,20 @@
                     <w:jc w:val="center"/>
                   </w:pPr>
                   <w:r>
-                    <w:t xml:space="preserve">7897742</w:t>
-                  </w:r>
-                </w:p>
-              </w:tc>
-              <w:tc>
-                <w:tcPr/>
-                <w:p>
-                  <w:pPr>
-                    <w:pStyle w:val="Compact"/>
-                    <w:jc w:val="right"/>
-                    <w:jc w:val="center"/>
-                  </w:pPr>
-                  <w:r>
-                    <w:t xml:space="preserve">7897742</w:t>
+                    <w:t xml:space="preserve">7808398</w:t>
+                  </w:r>
+                </w:p>
+              </w:tc>
+              <w:tc>
+                <w:tcPr/>
+                <w:p>
+                  <w:pPr>
+                    <w:pStyle w:val="Compact"/>
+                    <w:jc w:val="right"/>
+                    <w:jc w:val="center"/>
+                  </w:pPr>
+                  <w:r>
+                    <w:t xml:space="preserve">7808398</w:t>
                   </w:r>
                 </w:p>
               </w:tc>
@@ -9174,20 +9583,20 @@
                     <w:jc w:val="center"/>
                   </w:pPr>
                   <w:r>
-                    <w:t xml:space="preserve">7897742</w:t>
-                  </w:r>
-                </w:p>
-              </w:tc>
-              <w:tc>
-                <w:tcPr/>
-                <w:p>
-                  <w:pPr>
-                    <w:pStyle w:val="Compact"/>
-                    <w:jc w:val="right"/>
-                    <w:jc w:val="center"/>
-                  </w:pPr>
-                  <w:r>
-                    <w:t xml:space="preserve">7897742</w:t>
+                    <w:t xml:space="preserve">7808398</w:t>
+                  </w:r>
+                </w:p>
+              </w:tc>
+              <w:tc>
+                <w:tcPr/>
+                <w:p>
+                  <w:pPr>
+                    <w:pStyle w:val="Compact"/>
+                    <w:jc w:val="right"/>
+                    <w:jc w:val="center"/>
+                  </w:pPr>
+                  <w:r>
+                    <w:t xml:space="preserve">7808398</w:t>
                   </w:r>
                 </w:p>
               </w:tc>
@@ -9306,20 +9715,20 @@
                     <w:jc w:val="center"/>
                   </w:pPr>
                   <w:r>
-                    <w:t xml:space="preserve">7897742</w:t>
-                  </w:r>
-                </w:p>
-              </w:tc>
-              <w:tc>
-                <w:tcPr/>
-                <w:p>
-                  <w:pPr>
-                    <w:pStyle w:val="Compact"/>
-                    <w:jc w:val="right"/>
-                    <w:jc w:val="center"/>
-                  </w:pPr>
-                  <w:r>
-                    <w:t xml:space="preserve">7897742</w:t>
+                    <w:t xml:space="preserve">7808398</w:t>
+                  </w:r>
+                </w:p>
+              </w:tc>
+              <w:tc>
+                <w:tcPr/>
+                <w:p>
+                  <w:pPr>
+                    <w:pStyle w:val="Compact"/>
+                    <w:jc w:val="right"/>
+                    <w:jc w:val="center"/>
+                  </w:pPr>
+                  <w:r>
+                    <w:t xml:space="preserve">7808398</w:t>
                   </w:r>
                 </w:p>
               </w:tc>
@@ -9438,20 +9847,20 @@
                     <w:jc w:val="center"/>
                   </w:pPr>
                   <w:r>
-                    <w:t xml:space="preserve">1658130</w:t>
-                  </w:r>
-                </w:p>
-              </w:tc>
-              <w:tc>
-                <w:tcPr/>
-                <w:p>
-                  <w:pPr>
-                    <w:pStyle w:val="Compact"/>
-                    <w:jc w:val="right"/>
-                    <w:jc w:val="center"/>
-                  </w:pPr>
-                  <w:r>
-                    <w:t xml:space="preserve">1658130</w:t>
+                    <w:t xml:space="preserve">1628008</w:t>
+                  </w:r>
+                </w:p>
+              </w:tc>
+              <w:tc>
+                <w:tcPr/>
+                <w:p>
+                  <w:pPr>
+                    <w:pStyle w:val="Compact"/>
+                    <w:jc w:val="right"/>
+                    <w:jc w:val="center"/>
+                  </w:pPr>
+                  <w:r>
+                    <w:t xml:space="preserve">1628008</w:t>
                   </w:r>
                 </w:p>
               </w:tc>
@@ -9570,20 +9979,20 @@
                     <w:jc w:val="center"/>
                   </w:pPr>
                   <w:r>
-                    <w:t xml:space="preserve">1658130</w:t>
-                  </w:r>
-                </w:p>
-              </w:tc>
-              <w:tc>
-                <w:tcPr/>
-                <w:p>
-                  <w:pPr>
-                    <w:pStyle w:val="Compact"/>
-                    <w:jc w:val="right"/>
-                    <w:jc w:val="center"/>
-                  </w:pPr>
-                  <w:r>
-                    <w:t xml:space="preserve">1658130</w:t>
+                    <w:t xml:space="preserve">1628008</w:t>
+                  </w:r>
+                </w:p>
+              </w:tc>
+              <w:tc>
+                <w:tcPr/>
+                <w:p>
+                  <w:pPr>
+                    <w:pStyle w:val="Compact"/>
+                    <w:jc w:val="right"/>
+                    <w:jc w:val="center"/>
+                  </w:pPr>
+                  <w:r>
+                    <w:t xml:space="preserve">1628008</w:t>
                   </w:r>
                 </w:p>
               </w:tc>
@@ -9702,20 +10111,20 @@
                     <w:jc w:val="center"/>
                   </w:pPr>
                   <w:r>
-                    <w:t xml:space="preserve">1658130</w:t>
-                  </w:r>
-                </w:p>
-              </w:tc>
-              <w:tc>
-                <w:tcPr/>
-                <w:p>
-                  <w:pPr>
-                    <w:pStyle w:val="Compact"/>
-                    <w:jc w:val="right"/>
-                    <w:jc w:val="center"/>
-                  </w:pPr>
-                  <w:r>
-                    <w:t xml:space="preserve">1658130</w:t>
+                    <w:t xml:space="preserve">1628008</w:t>
+                  </w:r>
+                </w:p>
+              </w:tc>
+              <w:tc>
+                <w:tcPr/>
+                <w:p>
+                  <w:pPr>
+                    <w:pStyle w:val="Compact"/>
+                    <w:jc w:val="right"/>
+                    <w:jc w:val="center"/>
+                  </w:pPr>
+                  <w:r>
+                    <w:t xml:space="preserve">1628008</w:t>
                   </w:r>
                 </w:p>
               </w:tc>
@@ -9834,20 +10243,20 @@
                     <w:jc w:val="center"/>
                   </w:pPr>
                   <w:r>
-                    <w:t xml:space="preserve">1658130</w:t>
-                  </w:r>
-                </w:p>
-              </w:tc>
-              <w:tc>
-                <w:tcPr/>
-                <w:p>
-                  <w:pPr>
-                    <w:pStyle w:val="Compact"/>
-                    <w:jc w:val="right"/>
-                    <w:jc w:val="center"/>
-                  </w:pPr>
-                  <w:r>
-                    <w:t xml:space="preserve">1658130</w:t>
+                    <w:t xml:space="preserve">1628008</w:t>
+                  </w:r>
+                </w:p>
+              </w:tc>
+              <w:tc>
+                <w:tcPr/>
+                <w:p>
+                  <w:pPr>
+                    <w:pStyle w:val="Compact"/>
+                    <w:jc w:val="right"/>
+                    <w:jc w:val="center"/>
+                  </w:pPr>
+                  <w:r>
+                    <w:t xml:space="preserve">1628008</w:t>
                   </w:r>
                 </w:p>
               </w:tc>
@@ -9966,20 +10375,20 @@
                     <w:jc w:val="center"/>
                   </w:pPr>
                   <w:r>
-                    <w:t xml:space="preserve">1658130</w:t>
-                  </w:r>
-                </w:p>
-              </w:tc>
-              <w:tc>
-                <w:tcPr/>
-                <w:p>
-                  <w:pPr>
-                    <w:pStyle w:val="Compact"/>
-                    <w:jc w:val="right"/>
-                    <w:jc w:val="center"/>
-                  </w:pPr>
-                  <w:r>
-                    <w:t xml:space="preserve">1658130</w:t>
+                    <w:t xml:space="preserve">1628008</w:t>
+                  </w:r>
+                </w:p>
+              </w:tc>
+              <w:tc>
+                <w:tcPr/>
+                <w:p>
+                  <w:pPr>
+                    <w:pStyle w:val="Compact"/>
+                    <w:jc w:val="right"/>
+                    <w:jc w:val="center"/>
+                  </w:pPr>
+                  <w:r>
+                    <w:t xml:space="preserve">1628008</w:t>
                   </w:r>
                 </w:p>
               </w:tc>
@@ -10098,20 +10507,20 @@
                     <w:jc w:val="center"/>
                   </w:pPr>
                   <w:r>
-                    <w:t xml:space="preserve">1658130</w:t>
-                  </w:r>
-                </w:p>
-              </w:tc>
-              <w:tc>
-                <w:tcPr/>
-                <w:p>
-                  <w:pPr>
-                    <w:pStyle w:val="Compact"/>
-                    <w:jc w:val="right"/>
-                    <w:jc w:val="center"/>
-                  </w:pPr>
-                  <w:r>
-                    <w:t xml:space="preserve">1658130</w:t>
+                    <w:t xml:space="preserve">1628008</w:t>
+                  </w:r>
+                </w:p>
+              </w:tc>
+              <w:tc>
+                <w:tcPr/>
+                <w:p>
+                  <w:pPr>
+                    <w:pStyle w:val="Compact"/>
+                    <w:jc w:val="right"/>
+                    <w:jc w:val="center"/>
+                  </w:pPr>
+                  <w:r>
+                    <w:t xml:space="preserve">1628008</w:t>
                   </w:r>
                 </w:p>
               </w:tc>
@@ -10230,20 +10639,20 @@
                     <w:jc w:val="center"/>
                   </w:pPr>
                   <w:r>
-                    <w:t xml:space="preserve">510085</w:t>
-                  </w:r>
-                </w:p>
-              </w:tc>
-              <w:tc>
-                <w:tcPr/>
-                <w:p>
-                  <w:pPr>
-                    <w:pStyle w:val="Compact"/>
-                    <w:jc w:val="right"/>
-                    <w:jc w:val="center"/>
-                  </w:pPr>
-                  <w:r>
-                    <w:t xml:space="preserve">510085</w:t>
+                    <w:t xml:space="preserve">503339</w:t>
+                  </w:r>
+                </w:p>
+              </w:tc>
+              <w:tc>
+                <w:tcPr/>
+                <w:p>
+                  <w:pPr>
+                    <w:pStyle w:val="Compact"/>
+                    <w:jc w:val="right"/>
+                    <w:jc w:val="center"/>
+                  </w:pPr>
+                  <w:r>
+                    <w:t xml:space="preserve">503339</w:t>
                   </w:r>
                 </w:p>
               </w:tc>
@@ -10362,20 +10771,20 @@
                     <w:jc w:val="center"/>
                   </w:pPr>
                   <w:r>
-                    <w:t xml:space="preserve">510085</w:t>
-                  </w:r>
-                </w:p>
-              </w:tc>
-              <w:tc>
-                <w:tcPr/>
-                <w:p>
-                  <w:pPr>
-                    <w:pStyle w:val="Compact"/>
-                    <w:jc w:val="right"/>
-                    <w:jc w:val="center"/>
-                  </w:pPr>
-                  <w:r>
-                    <w:t xml:space="preserve">510085</w:t>
+                    <w:t xml:space="preserve">503339</w:t>
+                  </w:r>
+                </w:p>
+              </w:tc>
+              <w:tc>
+                <w:tcPr/>
+                <w:p>
+                  <w:pPr>
+                    <w:pStyle w:val="Compact"/>
+                    <w:jc w:val="right"/>
+                    <w:jc w:val="center"/>
+                  </w:pPr>
+                  <w:r>
+                    <w:t xml:space="preserve">503339</w:t>
                   </w:r>
                 </w:p>
               </w:tc>
@@ -10494,20 +10903,20 @@
                     <w:jc w:val="center"/>
                   </w:pPr>
                   <w:r>
-                    <w:t xml:space="preserve">510085</w:t>
-                  </w:r>
-                </w:p>
-              </w:tc>
-              <w:tc>
-                <w:tcPr/>
-                <w:p>
-                  <w:pPr>
-                    <w:pStyle w:val="Compact"/>
-                    <w:jc w:val="right"/>
-                    <w:jc w:val="center"/>
-                  </w:pPr>
-                  <w:r>
-                    <w:t xml:space="preserve">510085</w:t>
+                    <w:t xml:space="preserve">503339</w:t>
+                  </w:r>
+                </w:p>
+              </w:tc>
+              <w:tc>
+                <w:tcPr/>
+                <w:p>
+                  <w:pPr>
+                    <w:pStyle w:val="Compact"/>
+                    <w:jc w:val="right"/>
+                    <w:jc w:val="center"/>
+                  </w:pPr>
+                  <w:r>
+                    <w:t xml:space="preserve">503339</w:t>
                   </w:r>
                 </w:p>
               </w:tc>
@@ -10626,20 +11035,20 @@
                     <w:jc w:val="center"/>
                   </w:pPr>
                   <w:r>
-                    <w:t xml:space="preserve">510085</w:t>
-                  </w:r>
-                </w:p>
-              </w:tc>
-              <w:tc>
-                <w:tcPr/>
-                <w:p>
-                  <w:pPr>
-                    <w:pStyle w:val="Compact"/>
-                    <w:jc w:val="right"/>
-                    <w:jc w:val="center"/>
-                  </w:pPr>
-                  <w:r>
-                    <w:t xml:space="preserve">510085</w:t>
+                    <w:t xml:space="preserve">503339</w:t>
+                  </w:r>
+                </w:p>
+              </w:tc>
+              <w:tc>
+                <w:tcPr/>
+                <w:p>
+                  <w:pPr>
+                    <w:pStyle w:val="Compact"/>
+                    <w:jc w:val="right"/>
+                    <w:jc w:val="center"/>
+                  </w:pPr>
+                  <w:r>
+                    <w:t xml:space="preserve">503339</w:t>
                   </w:r>
                 </w:p>
               </w:tc>
@@ -10758,20 +11167,20 @@
                     <w:jc w:val="center"/>
                   </w:pPr>
                   <w:r>
-                    <w:t xml:space="preserve">510085</w:t>
-                  </w:r>
-                </w:p>
-              </w:tc>
-              <w:tc>
-                <w:tcPr/>
-                <w:p>
-                  <w:pPr>
-                    <w:pStyle w:val="Compact"/>
-                    <w:jc w:val="right"/>
-                    <w:jc w:val="center"/>
-                  </w:pPr>
-                  <w:r>
-                    <w:t xml:space="preserve">510085</w:t>
+                    <w:t xml:space="preserve">503339</w:t>
+                  </w:r>
+                </w:p>
+              </w:tc>
+              <w:tc>
+                <w:tcPr/>
+                <w:p>
+                  <w:pPr>
+                    <w:pStyle w:val="Compact"/>
+                    <w:jc w:val="right"/>
+                    <w:jc w:val="center"/>
+                  </w:pPr>
+                  <w:r>
+                    <w:t xml:space="preserve">503339</w:t>
                   </w:r>
                 </w:p>
               </w:tc>
@@ -10890,20 +11299,20 @@
                     <w:jc w:val="center"/>
                   </w:pPr>
                   <w:r>
-                    <w:t xml:space="preserve">510085</w:t>
-                  </w:r>
-                </w:p>
-              </w:tc>
-              <w:tc>
-                <w:tcPr/>
-                <w:p>
-                  <w:pPr>
-                    <w:pStyle w:val="Compact"/>
-                    <w:jc w:val="right"/>
-                    <w:jc w:val="center"/>
-                  </w:pPr>
-                  <w:r>
-                    <w:t xml:space="preserve">510085</w:t>
+                    <w:t xml:space="preserve">503339</w:t>
+                  </w:r>
+                </w:p>
+              </w:tc>
+              <w:tc>
+                <w:tcPr/>
+                <w:p>
+                  <w:pPr>
+                    <w:pStyle w:val="Compact"/>
+                    <w:jc w:val="right"/>
+                    <w:jc w:val="center"/>
+                  </w:pPr>
+                  <w:r>
+                    <w:t xml:space="preserve">503339</w:t>
                   </w:r>
                 </w:p>
               </w:tc>
@@ -11022,20 +11431,20 @@
                     <w:jc w:val="center"/>
                   </w:pPr>
                   <w:r>
-                    <w:t xml:space="preserve">2158197</w:t>
-                  </w:r>
-                </w:p>
-              </w:tc>
-              <w:tc>
-                <w:tcPr/>
-                <w:p>
-                  <w:pPr>
-                    <w:pStyle w:val="Compact"/>
-                    <w:jc w:val="right"/>
-                    <w:jc w:val="center"/>
-                  </w:pPr>
-                  <w:r>
-                    <w:t xml:space="preserve">2158197</w:t>
+                    <w:t xml:space="preserve">2130248</w:t>
+                  </w:r>
+                </w:p>
+              </w:tc>
+              <w:tc>
+                <w:tcPr/>
+                <w:p>
+                  <w:pPr>
+                    <w:pStyle w:val="Compact"/>
+                    <w:jc w:val="right"/>
+                    <w:jc w:val="center"/>
+                  </w:pPr>
+                  <w:r>
+                    <w:t xml:space="preserve">2130248</w:t>
                   </w:r>
                 </w:p>
               </w:tc>
@@ -11154,20 +11563,20 @@
                     <w:jc w:val="center"/>
                   </w:pPr>
                   <w:r>
-                    <w:t xml:space="preserve">2158197</w:t>
-                  </w:r>
-                </w:p>
-              </w:tc>
-              <w:tc>
-                <w:tcPr/>
-                <w:p>
-                  <w:pPr>
-                    <w:pStyle w:val="Compact"/>
-                    <w:jc w:val="right"/>
-                    <w:jc w:val="center"/>
-                  </w:pPr>
-                  <w:r>
-                    <w:t xml:space="preserve">2158197</w:t>
+                    <w:t xml:space="preserve">2130248</w:t>
+                  </w:r>
+                </w:p>
+              </w:tc>
+              <w:tc>
+                <w:tcPr/>
+                <w:p>
+                  <w:pPr>
+                    <w:pStyle w:val="Compact"/>
+                    <w:jc w:val="right"/>
+                    <w:jc w:val="center"/>
+                  </w:pPr>
+                  <w:r>
+                    <w:t xml:space="preserve">2130248</w:t>
                   </w:r>
                 </w:p>
               </w:tc>
@@ -11286,20 +11695,20 @@
                     <w:jc w:val="center"/>
                   </w:pPr>
                   <w:r>
-                    <w:t xml:space="preserve">2158197</w:t>
-                  </w:r>
-                </w:p>
-              </w:tc>
-              <w:tc>
-                <w:tcPr/>
-                <w:p>
-                  <w:pPr>
-                    <w:pStyle w:val="Compact"/>
-                    <w:jc w:val="right"/>
-                    <w:jc w:val="center"/>
-                  </w:pPr>
-                  <w:r>
-                    <w:t xml:space="preserve">2158197</w:t>
+                    <w:t xml:space="preserve">2130248</w:t>
+                  </w:r>
+                </w:p>
+              </w:tc>
+              <w:tc>
+                <w:tcPr/>
+                <w:p>
+                  <w:pPr>
+                    <w:pStyle w:val="Compact"/>
+                    <w:jc w:val="right"/>
+                    <w:jc w:val="center"/>
+                  </w:pPr>
+                  <w:r>
+                    <w:t xml:space="preserve">2130248</w:t>
                   </w:r>
                 </w:p>
               </w:tc>
@@ -11418,20 +11827,20 @@
                     <w:jc w:val="center"/>
                   </w:pPr>
                   <w:r>
-                    <w:t xml:space="preserve">2158197</w:t>
-                  </w:r>
-                </w:p>
-              </w:tc>
-              <w:tc>
-                <w:tcPr/>
-                <w:p>
-                  <w:pPr>
-                    <w:pStyle w:val="Compact"/>
-                    <w:jc w:val="right"/>
-                    <w:jc w:val="center"/>
-                  </w:pPr>
-                  <w:r>
-                    <w:t xml:space="preserve">2158197</w:t>
+                    <w:t xml:space="preserve">2130248</w:t>
+                  </w:r>
+                </w:p>
+              </w:tc>
+              <w:tc>
+                <w:tcPr/>
+                <w:p>
+                  <w:pPr>
+                    <w:pStyle w:val="Compact"/>
+                    <w:jc w:val="right"/>
+                    <w:jc w:val="center"/>
+                  </w:pPr>
+                  <w:r>
+                    <w:t xml:space="preserve">2130248</w:t>
                   </w:r>
                 </w:p>
               </w:tc>
@@ -11550,20 +11959,20 @@
                     <w:jc w:val="center"/>
                   </w:pPr>
                   <w:r>
-                    <w:t xml:space="preserve">2158197</w:t>
-                  </w:r>
-                </w:p>
-              </w:tc>
-              <w:tc>
-                <w:tcPr/>
-                <w:p>
-                  <w:pPr>
-                    <w:pStyle w:val="Compact"/>
-                    <w:jc w:val="right"/>
-                    <w:jc w:val="center"/>
-                  </w:pPr>
-                  <w:r>
-                    <w:t xml:space="preserve">2158197</w:t>
+                    <w:t xml:space="preserve">2130248</w:t>
+                  </w:r>
+                </w:p>
+              </w:tc>
+              <w:tc>
+                <w:tcPr/>
+                <w:p>
+                  <w:pPr>
+                    <w:pStyle w:val="Compact"/>
+                    <w:jc w:val="right"/>
+                    <w:jc w:val="center"/>
+                  </w:pPr>
+                  <w:r>
+                    <w:t xml:space="preserve">2130248</w:t>
                   </w:r>
                 </w:p>
               </w:tc>
@@ -11682,20 +12091,20 @@
                     <w:jc w:val="center"/>
                   </w:pPr>
                   <w:r>
-                    <w:t xml:space="preserve">2158197</w:t>
-                  </w:r>
-                </w:p>
-              </w:tc>
-              <w:tc>
-                <w:tcPr/>
-                <w:p>
-                  <w:pPr>
-                    <w:pStyle w:val="Compact"/>
-                    <w:jc w:val="right"/>
-                    <w:jc w:val="center"/>
-                  </w:pPr>
-                  <w:r>
-                    <w:t xml:space="preserve">2158197</w:t>
+                    <w:t xml:space="preserve">2130248</w:t>
+                  </w:r>
+                </w:p>
+              </w:tc>
+              <w:tc>
+                <w:tcPr/>
+                <w:p>
+                  <w:pPr>
+                    <w:pStyle w:val="Compact"/>
+                    <w:jc w:val="right"/>
+                    <w:jc w:val="center"/>
+                  </w:pPr>
+                  <w:r>
+                    <w:t xml:space="preserve">2130248</w:t>
                   </w:r>
                 </w:p>
               </w:tc>
@@ -11814,20 +12223,20 @@
                     <w:jc w:val="center"/>
                   </w:pPr>
                   <w:r>
-                    <w:t xml:space="preserve">3010827</w:t>
-                  </w:r>
-                </w:p>
-              </w:tc>
-              <w:tc>
-                <w:tcPr/>
-                <w:p>
-                  <w:pPr>
-                    <w:pStyle w:val="Compact"/>
-                    <w:jc w:val="right"/>
-                    <w:jc w:val="center"/>
-                  </w:pPr>
-                  <w:r>
-                    <w:t xml:space="preserve">3010827</w:t>
+                    <w:t xml:space="preserve">2955723</w:t>
+                  </w:r>
+                </w:p>
+              </w:tc>
+              <w:tc>
+                <w:tcPr/>
+                <w:p>
+                  <w:pPr>
+                    <w:pStyle w:val="Compact"/>
+                    <w:jc w:val="right"/>
+                    <w:jc w:val="center"/>
+                  </w:pPr>
+                  <w:r>
+                    <w:t xml:space="preserve">2955723</w:t>
                   </w:r>
                 </w:p>
               </w:tc>
@@ -11946,20 +12355,20 @@
                     <w:jc w:val="center"/>
                   </w:pPr>
                   <w:r>
-                    <w:t xml:space="preserve">3010827</w:t>
-                  </w:r>
-                </w:p>
-              </w:tc>
-              <w:tc>
-                <w:tcPr/>
-                <w:p>
-                  <w:pPr>
-                    <w:pStyle w:val="Compact"/>
-                    <w:jc w:val="right"/>
-                    <w:jc w:val="center"/>
-                  </w:pPr>
-                  <w:r>
-                    <w:t xml:space="preserve">3010827</w:t>
+                    <w:t xml:space="preserve">2955723</w:t>
+                  </w:r>
+                </w:p>
+              </w:tc>
+              <w:tc>
+                <w:tcPr/>
+                <w:p>
+                  <w:pPr>
+                    <w:pStyle w:val="Compact"/>
+                    <w:jc w:val="right"/>
+                    <w:jc w:val="center"/>
+                  </w:pPr>
+                  <w:r>
+                    <w:t xml:space="preserve">2955723</w:t>
                   </w:r>
                 </w:p>
               </w:tc>
@@ -12078,20 +12487,20 @@
                     <w:jc w:val="center"/>
                   </w:pPr>
                   <w:r>
-                    <w:t xml:space="preserve">3010827</w:t>
-                  </w:r>
-                </w:p>
-              </w:tc>
-              <w:tc>
-                <w:tcPr/>
-                <w:p>
-                  <w:pPr>
-                    <w:pStyle w:val="Compact"/>
-                    <w:jc w:val="right"/>
-                    <w:jc w:val="center"/>
-                  </w:pPr>
-                  <w:r>
-                    <w:t xml:space="preserve">3010827</w:t>
+                    <w:t xml:space="preserve">2955723</w:t>
+                  </w:r>
+                </w:p>
+              </w:tc>
+              <w:tc>
+                <w:tcPr/>
+                <w:p>
+                  <w:pPr>
+                    <w:pStyle w:val="Compact"/>
+                    <w:jc w:val="right"/>
+                    <w:jc w:val="center"/>
+                  </w:pPr>
+                  <w:r>
+                    <w:t xml:space="preserve">2955723</w:t>
                   </w:r>
                 </w:p>
               </w:tc>
@@ -12210,20 +12619,20 @@
                     <w:jc w:val="center"/>
                   </w:pPr>
                   <w:r>
-                    <w:t xml:space="preserve">3010827</w:t>
-                  </w:r>
-                </w:p>
-              </w:tc>
-              <w:tc>
-                <w:tcPr/>
-                <w:p>
-                  <w:pPr>
-                    <w:pStyle w:val="Compact"/>
-                    <w:jc w:val="right"/>
-                    <w:jc w:val="center"/>
-                  </w:pPr>
-                  <w:r>
-                    <w:t xml:space="preserve">3010827</w:t>
+                    <w:t xml:space="preserve">2955723</w:t>
+                  </w:r>
+                </w:p>
+              </w:tc>
+              <w:tc>
+                <w:tcPr/>
+                <w:p>
+                  <w:pPr>
+                    <w:pStyle w:val="Compact"/>
+                    <w:jc w:val="right"/>
+                    <w:jc w:val="center"/>
+                  </w:pPr>
+                  <w:r>
+                    <w:t xml:space="preserve">2955723</w:t>
                   </w:r>
                 </w:p>
               </w:tc>
@@ -12342,20 +12751,20 @@
                     <w:jc w:val="center"/>
                   </w:pPr>
                   <w:r>
-                    <w:t xml:space="preserve">3010827</w:t>
-                  </w:r>
-                </w:p>
-              </w:tc>
-              <w:tc>
-                <w:tcPr/>
-                <w:p>
-                  <w:pPr>
-                    <w:pStyle w:val="Compact"/>
-                    <w:jc w:val="right"/>
-                    <w:jc w:val="center"/>
-                  </w:pPr>
-                  <w:r>
-                    <w:t xml:space="preserve">3010827</w:t>
+                    <w:t xml:space="preserve">2955723</w:t>
+                  </w:r>
+                </w:p>
+              </w:tc>
+              <w:tc>
+                <w:tcPr/>
+                <w:p>
+                  <w:pPr>
+                    <w:pStyle w:val="Compact"/>
+                    <w:jc w:val="right"/>
+                    <w:jc w:val="center"/>
+                  </w:pPr>
+                  <w:r>
+                    <w:t xml:space="preserve">2955723</w:t>
                   </w:r>
                 </w:p>
               </w:tc>
@@ -12474,20 +12883,20 @@
                     <w:jc w:val="center"/>
                   </w:pPr>
                   <w:r>
-                    <w:t xml:space="preserve">3010827</w:t>
-                  </w:r>
-                </w:p>
-              </w:tc>
-              <w:tc>
-                <w:tcPr/>
-                <w:p>
-                  <w:pPr>
-                    <w:pStyle w:val="Compact"/>
-                    <w:jc w:val="right"/>
-                    <w:jc w:val="center"/>
-                  </w:pPr>
-                  <w:r>
-                    <w:t xml:space="preserve">3010827</w:t>
+                    <w:t xml:space="preserve">2955723</w:t>
+                  </w:r>
+                </w:p>
+              </w:tc>
+              <w:tc>
+                <w:tcPr/>
+                <w:p>
+                  <w:pPr>
+                    <w:pStyle w:val="Compact"/>
+                    <w:jc w:val="right"/>
+                    <w:jc w:val="center"/>
+                  </w:pPr>
+                  <w:r>
+                    <w:t xml:space="preserve">2955723</w:t>
                   </w:r>
                 </w:p>
               </w:tc>
@@ -12606,20 +13015,20 @@
                     <w:jc w:val="center"/>
                   </w:pPr>
                   <w:r>
-                    <w:t xml:space="preserve">181959</w:t>
-                  </w:r>
-                </w:p>
-              </w:tc>
-              <w:tc>
-                <w:tcPr/>
-                <w:p>
-                  <w:pPr>
-                    <w:pStyle w:val="Compact"/>
-                    <w:jc w:val="right"/>
-                    <w:jc w:val="center"/>
-                  </w:pPr>
-                  <w:r>
-                    <w:t xml:space="preserve">181959</w:t>
+                    <w:t xml:space="preserve">179634</w:t>
+                  </w:r>
+                </w:p>
+              </w:tc>
+              <w:tc>
+                <w:tcPr/>
+                <w:p>
+                  <w:pPr>
+                    <w:pStyle w:val="Compact"/>
+                    <w:jc w:val="right"/>
+                    <w:jc w:val="center"/>
+                  </w:pPr>
+                  <w:r>
+                    <w:t xml:space="preserve">179634</w:t>
                   </w:r>
                 </w:p>
               </w:tc>
@@ -12738,20 +13147,20 @@
                     <w:jc w:val="center"/>
                   </w:pPr>
                   <w:r>
-                    <w:t xml:space="preserve">181959</w:t>
-                  </w:r>
-                </w:p>
-              </w:tc>
-              <w:tc>
-                <w:tcPr/>
-                <w:p>
-                  <w:pPr>
-                    <w:pStyle w:val="Compact"/>
-                    <w:jc w:val="right"/>
-                    <w:jc w:val="center"/>
-                  </w:pPr>
-                  <w:r>
-                    <w:t xml:space="preserve">181959</w:t>
+                    <w:t xml:space="preserve">179634</w:t>
+                  </w:r>
+                </w:p>
+              </w:tc>
+              <w:tc>
+                <w:tcPr/>
+                <w:p>
+                  <w:pPr>
+                    <w:pStyle w:val="Compact"/>
+                    <w:jc w:val="right"/>
+                    <w:jc w:val="center"/>
+                  </w:pPr>
+                  <w:r>
+                    <w:t xml:space="preserve">179634</w:t>
                   </w:r>
                 </w:p>
               </w:tc>
@@ -12870,20 +13279,20 @@
                     <w:jc w:val="center"/>
                   </w:pPr>
                   <w:r>
-                    <w:t xml:space="preserve">181959</w:t>
-                  </w:r>
-                </w:p>
-              </w:tc>
-              <w:tc>
-                <w:tcPr/>
-                <w:p>
-                  <w:pPr>
-                    <w:pStyle w:val="Compact"/>
-                    <w:jc w:val="right"/>
-                    <w:jc w:val="center"/>
-                  </w:pPr>
-                  <w:r>
-                    <w:t xml:space="preserve">181959</w:t>
+                    <w:t xml:space="preserve">179634</w:t>
+                  </w:r>
+                </w:p>
+              </w:tc>
+              <w:tc>
+                <w:tcPr/>
+                <w:p>
+                  <w:pPr>
+                    <w:pStyle w:val="Compact"/>
+                    <w:jc w:val="right"/>
+                    <w:jc w:val="center"/>
+                  </w:pPr>
+                  <w:r>
+                    <w:t xml:space="preserve">179634</w:t>
                   </w:r>
                 </w:p>
               </w:tc>
@@ -13002,20 +13411,20 @@
                     <w:jc w:val="center"/>
                   </w:pPr>
                   <w:r>
-                    <w:t xml:space="preserve">181959</w:t>
-                  </w:r>
-                </w:p>
-              </w:tc>
-              <w:tc>
-                <w:tcPr/>
-                <w:p>
-                  <w:pPr>
-                    <w:pStyle w:val="Compact"/>
-                    <w:jc w:val="right"/>
-                    <w:jc w:val="center"/>
-                  </w:pPr>
-                  <w:r>
-                    <w:t xml:space="preserve">181959</w:t>
+                    <w:t xml:space="preserve">179634</w:t>
+                  </w:r>
+                </w:p>
+              </w:tc>
+              <w:tc>
+                <w:tcPr/>
+                <w:p>
+                  <w:pPr>
+                    <w:pStyle w:val="Compact"/>
+                    <w:jc w:val="right"/>
+                    <w:jc w:val="center"/>
+                  </w:pPr>
+                  <w:r>
+                    <w:t xml:space="preserve">179634</w:t>
                   </w:r>
                 </w:p>
               </w:tc>
@@ -13134,20 +13543,20 @@
                     <w:jc w:val="center"/>
                   </w:pPr>
                   <w:r>
-                    <w:t xml:space="preserve">181959</w:t>
-                  </w:r>
-                </w:p>
-              </w:tc>
-              <w:tc>
-                <w:tcPr/>
-                <w:p>
-                  <w:pPr>
-                    <w:pStyle w:val="Compact"/>
-                    <w:jc w:val="right"/>
-                    <w:jc w:val="center"/>
-                  </w:pPr>
-                  <w:r>
-                    <w:t xml:space="preserve">181959</w:t>
+                    <w:t xml:space="preserve">179634</w:t>
+                  </w:r>
+                </w:p>
+              </w:tc>
+              <w:tc>
+                <w:tcPr/>
+                <w:p>
+                  <w:pPr>
+                    <w:pStyle w:val="Compact"/>
+                    <w:jc w:val="right"/>
+                    <w:jc w:val="center"/>
+                  </w:pPr>
+                  <w:r>
+                    <w:t xml:space="preserve">179634</w:t>
                   </w:r>
                 </w:p>
               </w:tc>
@@ -13266,20 +13675,20 @@
                     <w:jc w:val="center"/>
                   </w:pPr>
                   <w:r>
-                    <w:t xml:space="preserve">181959</w:t>
-                  </w:r>
-                </w:p>
-              </w:tc>
-              <w:tc>
-                <w:tcPr/>
-                <w:p>
-                  <w:pPr>
-                    <w:pStyle w:val="Compact"/>
-                    <w:jc w:val="right"/>
-                    <w:jc w:val="center"/>
-                  </w:pPr>
-                  <w:r>
-                    <w:t xml:space="preserve">181959</w:t>
+                    <w:t xml:space="preserve">179634</w:t>
+                  </w:r>
+                </w:p>
+              </w:tc>
+              <w:tc>
+                <w:tcPr/>
+                <w:p>
+                  <w:pPr>
+                    <w:pStyle w:val="Compact"/>
+                    <w:jc w:val="right"/>
+                    <w:jc w:val="center"/>
+                  </w:pPr>
+                  <w:r>
+                    <w:t xml:space="preserve">179634</w:t>
                   </w:r>
                 </w:p>
               </w:tc>
@@ -13398,20 +13807,20 @@
                     <w:jc w:val="center"/>
                   </w:pPr>
                   <w:r>
-                    <w:t xml:space="preserve">3755251</w:t>
-                  </w:r>
-                </w:p>
-              </w:tc>
-              <w:tc>
-                <w:tcPr/>
-                <w:p>
-                  <w:pPr>
-                    <w:pStyle w:val="Compact"/>
-                    <w:jc w:val="right"/>
-                    <w:jc w:val="center"/>
-                  </w:pPr>
-                  <w:r>
-                    <w:t xml:space="preserve">3755251</w:t>
+                    <w:t xml:space="preserve">3677472</w:t>
+                  </w:r>
+                </w:p>
+              </w:tc>
+              <w:tc>
+                <w:tcPr/>
+                <w:p>
+                  <w:pPr>
+                    <w:pStyle w:val="Compact"/>
+                    <w:jc w:val="right"/>
+                    <w:jc w:val="center"/>
+                  </w:pPr>
+                  <w:r>
+                    <w:t xml:space="preserve">3677472</w:t>
                   </w:r>
                 </w:p>
               </w:tc>
@@ -13530,20 +13939,20 @@
                     <w:jc w:val="center"/>
                   </w:pPr>
                   <w:r>
-                    <w:t xml:space="preserve">3755251</w:t>
-                  </w:r>
-                </w:p>
-              </w:tc>
-              <w:tc>
-                <w:tcPr/>
-                <w:p>
-                  <w:pPr>
-                    <w:pStyle w:val="Compact"/>
-                    <w:jc w:val="right"/>
-                    <w:jc w:val="center"/>
-                  </w:pPr>
-                  <w:r>
-                    <w:t xml:space="preserve">3755251</w:t>
+                    <w:t xml:space="preserve">3677472</w:t>
+                  </w:r>
+                </w:p>
+              </w:tc>
+              <w:tc>
+                <w:tcPr/>
+                <w:p>
+                  <w:pPr>
+                    <w:pStyle w:val="Compact"/>
+                    <w:jc w:val="right"/>
+                    <w:jc w:val="center"/>
+                  </w:pPr>
+                  <w:r>
+                    <w:t xml:space="preserve">3677472</w:t>
                   </w:r>
                 </w:p>
               </w:tc>
@@ -13662,20 +14071,20 @@
                     <w:jc w:val="center"/>
                   </w:pPr>
                   <w:r>
-                    <w:t xml:space="preserve">3755251</w:t>
-                  </w:r>
-                </w:p>
-              </w:tc>
-              <w:tc>
-                <w:tcPr/>
-                <w:p>
-                  <w:pPr>
-                    <w:pStyle w:val="Compact"/>
-                    <w:jc w:val="right"/>
-                    <w:jc w:val="center"/>
-                  </w:pPr>
-                  <w:r>
-                    <w:t xml:space="preserve">3755251</w:t>
+                    <w:t xml:space="preserve">3677472</w:t>
+                  </w:r>
+                </w:p>
+              </w:tc>
+              <w:tc>
+                <w:tcPr/>
+                <w:p>
+                  <w:pPr>
+                    <w:pStyle w:val="Compact"/>
+                    <w:jc w:val="right"/>
+                    <w:jc w:val="center"/>
+                  </w:pPr>
+                  <w:r>
+                    <w:t xml:space="preserve">3677472</w:t>
                   </w:r>
                 </w:p>
               </w:tc>
@@ -13794,20 +14203,20 @@
                     <w:jc w:val="center"/>
                   </w:pPr>
                   <w:r>
-                    <w:t xml:space="preserve">3755251</w:t>
-                  </w:r>
-                </w:p>
-              </w:tc>
-              <w:tc>
-                <w:tcPr/>
-                <w:p>
-                  <w:pPr>
-                    <w:pStyle w:val="Compact"/>
-                    <w:jc w:val="right"/>
-                    <w:jc w:val="center"/>
-                  </w:pPr>
-                  <w:r>
-                    <w:t xml:space="preserve">3755251</w:t>
+                    <w:t xml:space="preserve">3677472</w:t>
+                  </w:r>
+                </w:p>
+              </w:tc>
+              <w:tc>
+                <w:tcPr/>
+                <w:p>
+                  <w:pPr>
+                    <w:pStyle w:val="Compact"/>
+                    <w:jc w:val="right"/>
+                    <w:jc w:val="center"/>
+                  </w:pPr>
+                  <w:r>
+                    <w:t xml:space="preserve">3677472</w:t>
                   </w:r>
                 </w:p>
               </w:tc>
@@ -13926,20 +14335,20 @@
                     <w:jc w:val="center"/>
                   </w:pPr>
                   <w:r>
-                    <w:t xml:space="preserve">3755251</w:t>
-                  </w:r>
-                </w:p>
-              </w:tc>
-              <w:tc>
-                <w:tcPr/>
-                <w:p>
-                  <w:pPr>
-                    <w:pStyle w:val="Compact"/>
-                    <w:jc w:val="right"/>
-                    <w:jc w:val="center"/>
-                  </w:pPr>
-                  <w:r>
-                    <w:t xml:space="preserve">3755251</w:t>
+                    <w:t xml:space="preserve">3677472</w:t>
+                  </w:r>
+                </w:p>
+              </w:tc>
+              <w:tc>
+                <w:tcPr/>
+                <w:p>
+                  <w:pPr>
+                    <w:pStyle w:val="Compact"/>
+                    <w:jc w:val="right"/>
+                    <w:jc w:val="center"/>
+                  </w:pPr>
+                  <w:r>
+                    <w:t xml:space="preserve">3677472</w:t>
                   </w:r>
                 </w:p>
               </w:tc>
@@ -14058,20 +14467,20 @@
                     <w:jc w:val="center"/>
                   </w:pPr>
                   <w:r>
-                    <w:t xml:space="preserve">3755251</w:t>
-                  </w:r>
-                </w:p>
-              </w:tc>
-              <w:tc>
-                <w:tcPr/>
-                <w:p>
-                  <w:pPr>
-                    <w:pStyle w:val="Compact"/>
-                    <w:jc w:val="right"/>
-                    <w:jc w:val="center"/>
-                  </w:pPr>
-                  <w:r>
-                    <w:t xml:space="preserve">3755251</w:t>
+                    <w:t xml:space="preserve">3677472</w:t>
+                  </w:r>
+                </w:p>
+              </w:tc>
+              <w:tc>
+                <w:tcPr/>
+                <w:p>
+                  <w:pPr>
+                    <w:pStyle w:val="Compact"/>
+                    <w:jc w:val="right"/>
+                    <w:jc w:val="center"/>
+                  </w:pPr>
+                  <w:r>
+                    <w:t xml:space="preserve">3677472</w:t>
                   </w:r>
                 </w:p>
               </w:tc>
@@ -14190,20 +14599,20 @@
                     <w:jc w:val="center"/>
                   </w:pPr>
                   <w:r>
-                    <w:t xml:space="preserve">185750</w:t>
-                  </w:r>
-                </w:p>
-              </w:tc>
-              <w:tc>
-                <w:tcPr/>
-                <w:p>
-                  <w:pPr>
-                    <w:pStyle w:val="Compact"/>
-                    <w:jc w:val="right"/>
-                    <w:jc w:val="center"/>
-                  </w:pPr>
-                  <w:r>
-                    <w:t xml:space="preserve">185750</w:t>
+                    <w:t xml:space="preserve">183154</w:t>
+                  </w:r>
+                </w:p>
+              </w:tc>
+              <w:tc>
+                <w:tcPr/>
+                <w:p>
+                  <w:pPr>
+                    <w:pStyle w:val="Compact"/>
+                    <w:jc w:val="right"/>
+                    <w:jc w:val="center"/>
+                  </w:pPr>
+                  <w:r>
+                    <w:t xml:space="preserve">183154</w:t>
                   </w:r>
                 </w:p>
               </w:tc>
@@ -14322,20 +14731,20 @@
                     <w:jc w:val="center"/>
                   </w:pPr>
                   <w:r>
-                    <w:t xml:space="preserve">185750</w:t>
-                  </w:r>
-                </w:p>
-              </w:tc>
-              <w:tc>
-                <w:tcPr/>
-                <w:p>
-                  <w:pPr>
-                    <w:pStyle w:val="Compact"/>
-                    <w:jc w:val="right"/>
-                    <w:jc w:val="center"/>
-                  </w:pPr>
-                  <w:r>
-                    <w:t xml:space="preserve">185750</w:t>
+                    <w:t xml:space="preserve">183154</w:t>
+                  </w:r>
+                </w:p>
+              </w:tc>
+              <w:tc>
+                <w:tcPr/>
+                <w:p>
+                  <w:pPr>
+                    <w:pStyle w:val="Compact"/>
+                    <w:jc w:val="right"/>
+                    <w:jc w:val="center"/>
+                  </w:pPr>
+                  <w:r>
+                    <w:t xml:space="preserve">183154</w:t>
                   </w:r>
                 </w:p>
               </w:tc>
@@ -14454,20 +14863,20 @@
                     <w:jc w:val="center"/>
                   </w:pPr>
                   <w:r>
-                    <w:t xml:space="preserve">185750</w:t>
-                  </w:r>
-                </w:p>
-              </w:tc>
-              <w:tc>
-                <w:tcPr/>
-                <w:p>
-                  <w:pPr>
-                    <w:pStyle w:val="Compact"/>
-                    <w:jc w:val="right"/>
-                    <w:jc w:val="center"/>
-                  </w:pPr>
-                  <w:r>
-                    <w:t xml:space="preserve">185750</w:t>
+                    <w:t xml:space="preserve">183154</w:t>
+                  </w:r>
+                </w:p>
+              </w:tc>
+              <w:tc>
+                <w:tcPr/>
+                <w:p>
+                  <w:pPr>
+                    <w:pStyle w:val="Compact"/>
+                    <w:jc w:val="right"/>
+                    <w:jc w:val="center"/>
+                  </w:pPr>
+                  <w:r>
+                    <w:t xml:space="preserve">183154</w:t>
                   </w:r>
                 </w:p>
               </w:tc>
@@ -14586,20 +14995,20 @@
                     <w:jc w:val="center"/>
                   </w:pPr>
                   <w:r>
-                    <w:t xml:space="preserve">185750</w:t>
-                  </w:r>
-                </w:p>
-              </w:tc>
-              <w:tc>
-                <w:tcPr/>
-                <w:p>
-                  <w:pPr>
-                    <w:pStyle w:val="Compact"/>
-                    <w:jc w:val="right"/>
-                    <w:jc w:val="center"/>
-                  </w:pPr>
-                  <w:r>
-                    <w:t xml:space="preserve">185750</w:t>
+                    <w:t xml:space="preserve">183154</w:t>
+                  </w:r>
+                </w:p>
+              </w:tc>
+              <w:tc>
+                <w:tcPr/>
+                <w:p>
+                  <w:pPr>
+                    <w:pStyle w:val="Compact"/>
+                    <w:jc w:val="right"/>
+                    <w:jc w:val="center"/>
+                  </w:pPr>
+                  <w:r>
+                    <w:t xml:space="preserve">183154</w:t>
                   </w:r>
                 </w:p>
               </w:tc>
@@ -14718,20 +15127,20 @@
                     <w:jc w:val="center"/>
                   </w:pPr>
                   <w:r>
-                    <w:t xml:space="preserve">185750</w:t>
-                  </w:r>
-                </w:p>
-              </w:tc>
-              <w:tc>
-                <w:tcPr/>
-                <w:p>
-                  <w:pPr>
-                    <w:pStyle w:val="Compact"/>
-                    <w:jc w:val="right"/>
-                    <w:jc w:val="center"/>
-                  </w:pPr>
-                  <w:r>
-                    <w:t xml:space="preserve">185750</w:t>
+                    <w:t xml:space="preserve">183154</w:t>
+                  </w:r>
+                </w:p>
+              </w:tc>
+              <w:tc>
+                <w:tcPr/>
+                <w:p>
+                  <w:pPr>
+                    <w:pStyle w:val="Compact"/>
+                    <w:jc w:val="right"/>
+                    <w:jc w:val="center"/>
+                  </w:pPr>
+                  <w:r>
+                    <w:t xml:space="preserve">183154</w:t>
                   </w:r>
                 </w:p>
               </w:tc>
@@ -14850,20 +15259,20 @@
                     <w:jc w:val="center"/>
                   </w:pPr>
                   <w:r>
-                    <w:t xml:space="preserve">185750</w:t>
-                  </w:r>
-                </w:p>
-              </w:tc>
-              <w:tc>
-                <w:tcPr/>
-                <w:p>
-                  <w:pPr>
-                    <w:pStyle w:val="Compact"/>
-                    <w:jc w:val="right"/>
-                    <w:jc w:val="center"/>
-                  </w:pPr>
-                  <w:r>
-                    <w:t xml:space="preserve">185750</w:t>
+                    <w:t xml:space="preserve">183154</w:t>
+                  </w:r>
+                </w:p>
+              </w:tc>
+              <w:tc>
+                <w:tcPr/>
+                <w:p>
+                  <w:pPr>
+                    <w:pStyle w:val="Compact"/>
+                    <w:jc w:val="right"/>
+                    <w:jc w:val="center"/>
+                  </w:pPr>
+                  <w:r>
+                    <w:t xml:space="preserve">183154</w:t>
                   </w:r>
                 </w:p>
               </w:tc>
@@ -14982,20 +15391,20 @@
                     <w:jc w:val="center"/>
                   </w:pPr>
                   <w:r>
-                    <w:t xml:space="preserve">209920</w:t>
-                  </w:r>
-                </w:p>
-              </w:tc>
-              <w:tc>
-                <w:tcPr/>
-                <w:p>
-                  <w:pPr>
-                    <w:pStyle w:val="Compact"/>
-                    <w:jc w:val="right"/>
-                    <w:jc w:val="center"/>
-                  </w:pPr>
-                  <w:r>
-                    <w:t xml:space="preserve">209920</w:t>
+                    <w:t xml:space="preserve">208400</w:t>
+                  </w:r>
+                </w:p>
+              </w:tc>
+              <w:tc>
+                <w:tcPr/>
+                <w:p>
+                  <w:pPr>
+                    <w:pStyle w:val="Compact"/>
+                    <w:jc w:val="right"/>
+                    <w:jc w:val="center"/>
+                  </w:pPr>
+                  <w:r>
+                    <w:t xml:space="preserve">208400</w:t>
                   </w:r>
                 </w:p>
               </w:tc>
@@ -15114,20 +15523,20 @@
                     <w:jc w:val="center"/>
                   </w:pPr>
                   <w:r>
-                    <w:t xml:space="preserve">209920</w:t>
-                  </w:r>
-                </w:p>
-              </w:tc>
-              <w:tc>
-                <w:tcPr/>
-                <w:p>
-                  <w:pPr>
-                    <w:pStyle w:val="Compact"/>
-                    <w:jc w:val="right"/>
-                    <w:jc w:val="center"/>
-                  </w:pPr>
-                  <w:r>
-                    <w:t xml:space="preserve">209920</w:t>
+                    <w:t xml:space="preserve">208400</w:t>
+                  </w:r>
+                </w:p>
+              </w:tc>
+              <w:tc>
+                <w:tcPr/>
+                <w:p>
+                  <w:pPr>
+                    <w:pStyle w:val="Compact"/>
+                    <w:jc w:val="right"/>
+                    <w:jc w:val="center"/>
+                  </w:pPr>
+                  <w:r>
+                    <w:t xml:space="preserve">208400</w:t>
                   </w:r>
                 </w:p>
               </w:tc>
@@ -15246,20 +15655,20 @@
                     <w:jc w:val="center"/>
                   </w:pPr>
                   <w:r>
-                    <w:t xml:space="preserve">209920</w:t>
-                  </w:r>
-                </w:p>
-              </w:tc>
-              <w:tc>
-                <w:tcPr/>
-                <w:p>
-                  <w:pPr>
-                    <w:pStyle w:val="Compact"/>
-                    <w:jc w:val="right"/>
-                    <w:jc w:val="center"/>
-                  </w:pPr>
-                  <w:r>
-                    <w:t xml:space="preserve">209920</w:t>
+                    <w:t xml:space="preserve">208400</w:t>
+                  </w:r>
+                </w:p>
+              </w:tc>
+              <w:tc>
+                <w:tcPr/>
+                <w:p>
+                  <w:pPr>
+                    <w:pStyle w:val="Compact"/>
+                    <w:jc w:val="right"/>
+                    <w:jc w:val="center"/>
+                  </w:pPr>
+                  <w:r>
+                    <w:t xml:space="preserve">208400</w:t>
                   </w:r>
                 </w:p>
               </w:tc>
@@ -15378,20 +15787,20 @@
                     <w:jc w:val="center"/>
                   </w:pPr>
                   <w:r>
-                    <w:t xml:space="preserve">209920</w:t>
-                  </w:r>
-                </w:p>
-              </w:tc>
-              <w:tc>
-                <w:tcPr/>
-                <w:p>
-                  <w:pPr>
-                    <w:pStyle w:val="Compact"/>
-                    <w:jc w:val="right"/>
-                    <w:jc w:val="center"/>
-                  </w:pPr>
-                  <w:r>
-                    <w:t xml:space="preserve">209920</w:t>
+                    <w:t xml:space="preserve">208400</w:t>
+                  </w:r>
+                </w:p>
+              </w:tc>
+              <w:tc>
+                <w:tcPr/>
+                <w:p>
+                  <w:pPr>
+                    <w:pStyle w:val="Compact"/>
+                    <w:jc w:val="right"/>
+                    <w:jc w:val="center"/>
+                  </w:pPr>
+                  <w:r>
+                    <w:t xml:space="preserve">208400</w:t>
                   </w:r>
                 </w:p>
               </w:tc>
@@ -15510,20 +15919,20 @@
                     <w:jc w:val="center"/>
                   </w:pPr>
                   <w:r>
-                    <w:t xml:space="preserve">209920</w:t>
-                  </w:r>
-                </w:p>
-              </w:tc>
-              <w:tc>
-                <w:tcPr/>
-                <w:p>
-                  <w:pPr>
-                    <w:pStyle w:val="Compact"/>
-                    <w:jc w:val="right"/>
-                    <w:jc w:val="center"/>
-                  </w:pPr>
-                  <w:r>
-                    <w:t xml:space="preserve">209920</w:t>
+                    <w:t xml:space="preserve">208400</w:t>
+                  </w:r>
+                </w:p>
+              </w:tc>
+              <w:tc>
+                <w:tcPr/>
+                <w:p>
+                  <w:pPr>
+                    <w:pStyle w:val="Compact"/>
+                    <w:jc w:val="right"/>
+                    <w:jc w:val="center"/>
+                  </w:pPr>
+                  <w:r>
+                    <w:t xml:space="preserve">208400</w:t>
                   </w:r>
                 </w:p>
               </w:tc>
@@ -15642,20 +16051,20 @@
                     <w:jc w:val="center"/>
                   </w:pPr>
                   <w:r>
-                    <w:t xml:space="preserve">209920</w:t>
-                  </w:r>
-                </w:p>
-              </w:tc>
-              <w:tc>
-                <w:tcPr/>
-                <w:p>
-                  <w:pPr>
-                    <w:pStyle w:val="Compact"/>
-                    <w:jc w:val="right"/>
-                    <w:jc w:val="center"/>
-                  </w:pPr>
-                  <w:r>
-                    <w:t xml:space="preserve">209920</w:t>
+                    <w:t xml:space="preserve">208400</w:t>
+                  </w:r>
+                </w:p>
+              </w:tc>
+              <w:tc>
+                <w:tcPr/>
+                <w:p>
+                  <w:pPr>
+                    <w:pStyle w:val="Compact"/>
+                    <w:jc w:val="right"/>
+                    <w:jc w:val="center"/>
+                  </w:pPr>
+                  <w:r>
+                    <w:t xml:space="preserve">208400</w:t>
                   </w:r>
                 </w:p>
               </w:tc>
@@ -15774,20 +16183,20 @@
                     <w:jc w:val="center"/>
                   </w:pPr>
                   <w:r>
-                    <w:t xml:space="preserve">1427967</w:t>
-                  </w:r>
-                </w:p>
-              </w:tc>
-              <w:tc>
-                <w:tcPr/>
-                <w:p>
-                  <w:pPr>
-                    <w:pStyle w:val="Compact"/>
-                    <w:jc w:val="right"/>
-                    <w:jc w:val="center"/>
-                  </w:pPr>
-                  <w:r>
-                    <w:t xml:space="preserve">1427967</w:t>
+                    <w:t xml:space="preserve">1400322</w:t>
+                  </w:r>
+                </w:p>
+              </w:tc>
+              <w:tc>
+                <w:tcPr/>
+                <w:p>
+                  <w:pPr>
+                    <w:pStyle w:val="Compact"/>
+                    <w:jc w:val="right"/>
+                    <w:jc w:val="center"/>
+                  </w:pPr>
+                  <w:r>
+                    <w:t xml:space="preserve">1400322</w:t>
                   </w:r>
                 </w:p>
               </w:tc>
@@ -15906,20 +16315,20 @@
                     <w:jc w:val="center"/>
                   </w:pPr>
                   <w:r>
-                    <w:t xml:space="preserve">1427967</w:t>
-                  </w:r>
-                </w:p>
-              </w:tc>
-              <w:tc>
-                <w:tcPr/>
-                <w:p>
-                  <w:pPr>
-                    <w:pStyle w:val="Compact"/>
-                    <w:jc w:val="right"/>
-                    <w:jc w:val="center"/>
-                  </w:pPr>
-                  <w:r>
-                    <w:t xml:space="preserve">1427967</w:t>
+                    <w:t xml:space="preserve">1400322</w:t>
+                  </w:r>
+                </w:p>
+              </w:tc>
+              <w:tc>
+                <w:tcPr/>
+                <w:p>
+                  <w:pPr>
+                    <w:pStyle w:val="Compact"/>
+                    <w:jc w:val="right"/>
+                    <w:jc w:val="center"/>
+                  </w:pPr>
+                  <w:r>
+                    <w:t xml:space="preserve">1400322</w:t>
                   </w:r>
                 </w:p>
               </w:tc>
@@ -16038,20 +16447,20 @@
                     <w:jc w:val="center"/>
                   </w:pPr>
                   <w:r>
-                    <w:t xml:space="preserve">1427967</w:t>
-                  </w:r>
-                </w:p>
-              </w:tc>
-              <w:tc>
-                <w:tcPr/>
-                <w:p>
-                  <w:pPr>
-                    <w:pStyle w:val="Compact"/>
-                    <w:jc w:val="right"/>
-                    <w:jc w:val="center"/>
-                  </w:pPr>
-                  <w:r>
-                    <w:t xml:space="preserve">1427967</w:t>
+                    <w:t xml:space="preserve">1400322</w:t>
+                  </w:r>
+                </w:p>
+              </w:tc>
+              <w:tc>
+                <w:tcPr/>
+                <w:p>
+                  <w:pPr>
+                    <w:pStyle w:val="Compact"/>
+                    <w:jc w:val="right"/>
+                    <w:jc w:val="center"/>
+                  </w:pPr>
+                  <w:r>
+                    <w:t xml:space="preserve">1400322</w:t>
                   </w:r>
                 </w:p>
               </w:tc>
@@ -16170,20 +16579,20 @@
                     <w:jc w:val="center"/>
                   </w:pPr>
                   <w:r>
-                    <w:t xml:space="preserve">1427967</w:t>
-                  </w:r>
-                </w:p>
-              </w:tc>
-              <w:tc>
-                <w:tcPr/>
-                <w:p>
-                  <w:pPr>
-                    <w:pStyle w:val="Compact"/>
-                    <w:jc w:val="right"/>
-                    <w:jc w:val="center"/>
-                  </w:pPr>
-                  <w:r>
-                    <w:t xml:space="preserve">1427967</w:t>
+                    <w:t xml:space="preserve">1400322</w:t>
+                  </w:r>
+                </w:p>
+              </w:tc>
+              <w:tc>
+                <w:tcPr/>
+                <w:p>
+                  <w:pPr>
+                    <w:pStyle w:val="Compact"/>
+                    <w:jc w:val="right"/>
+                    <w:jc w:val="center"/>
+                  </w:pPr>
+                  <w:r>
+                    <w:t xml:space="preserve">1400322</w:t>
                   </w:r>
                 </w:p>
               </w:tc>
@@ -16302,20 +16711,20 @@
                     <w:jc w:val="center"/>
                   </w:pPr>
                   <w:r>
-                    <w:t xml:space="preserve">1427967</w:t>
-                  </w:r>
-                </w:p>
-              </w:tc>
-              <w:tc>
-                <w:tcPr/>
-                <w:p>
-                  <w:pPr>
-                    <w:pStyle w:val="Compact"/>
-                    <w:jc w:val="right"/>
-                    <w:jc w:val="center"/>
-                  </w:pPr>
-                  <w:r>
-                    <w:t xml:space="preserve">1427967</w:t>
+                    <w:t xml:space="preserve">1400322</w:t>
+                  </w:r>
+                </w:p>
+              </w:tc>
+              <w:tc>
+                <w:tcPr/>
+                <w:p>
+                  <w:pPr>
+                    <w:pStyle w:val="Compact"/>
+                    <w:jc w:val="right"/>
+                    <w:jc w:val="center"/>
+                  </w:pPr>
+                  <w:r>
+                    <w:t xml:space="preserve">1400322</w:t>
                   </w:r>
                 </w:p>
               </w:tc>
@@ -16434,20 +16843,20 @@
                     <w:jc w:val="center"/>
                   </w:pPr>
                   <w:r>
-                    <w:t xml:space="preserve">1427967</w:t>
-                  </w:r>
-                </w:p>
-              </w:tc>
-              <w:tc>
-                <w:tcPr/>
-                <w:p>
-                  <w:pPr>
-                    <w:pStyle w:val="Compact"/>
-                    <w:jc w:val="right"/>
-                    <w:jc w:val="center"/>
-                  </w:pPr>
-                  <w:r>
-                    <w:t xml:space="preserve">1427967</w:t>
+                    <w:t xml:space="preserve">1400322</w:t>
+                  </w:r>
+                </w:p>
+              </w:tc>
+              <w:tc>
+                <w:tcPr/>
+                <w:p>
+                  <w:pPr>
+                    <w:pStyle w:val="Compact"/>
+                    <w:jc w:val="right"/>
+                    <w:jc w:val="center"/>
+                  </w:pPr>
+                  <w:r>
+                    <w:t xml:space="preserve">1400322</w:t>
                   </w:r>
                 </w:p>
               </w:tc>
@@ -16566,20 +16975,20 @@
                     <w:jc w:val="center"/>
                   </w:pPr>
                   <w:r>
-                    <w:t xml:space="preserve">481447</w:t>
-                  </w:r>
-                </w:p>
-              </w:tc>
-              <w:tc>
-                <w:tcPr/>
-                <w:p>
-                  <w:pPr>
-                    <w:pStyle w:val="Compact"/>
-                    <w:jc w:val="right"/>
-                    <w:jc w:val="center"/>
-                  </w:pPr>
-                  <w:r>
-                    <w:t xml:space="preserve">481447</w:t>
+                    <w:t xml:space="preserve">474249</w:t>
+                  </w:r>
+                </w:p>
+              </w:tc>
+              <w:tc>
+                <w:tcPr/>
+                <w:p>
+                  <w:pPr>
+                    <w:pStyle w:val="Compact"/>
+                    <w:jc w:val="right"/>
+                    <w:jc w:val="center"/>
+                  </w:pPr>
+                  <w:r>
+                    <w:t xml:space="preserve">474249</w:t>
                   </w:r>
                 </w:p>
               </w:tc>
@@ -16698,20 +17107,20 @@
                     <w:jc w:val="center"/>
                   </w:pPr>
                   <w:r>
-                    <w:t xml:space="preserve">481447</w:t>
-                  </w:r>
-                </w:p>
-              </w:tc>
-              <w:tc>
-                <w:tcPr/>
-                <w:p>
-                  <w:pPr>
-                    <w:pStyle w:val="Compact"/>
-                    <w:jc w:val="right"/>
-                    <w:jc w:val="center"/>
-                  </w:pPr>
-                  <w:r>
-                    <w:t xml:space="preserve">481447</w:t>
+                    <w:t xml:space="preserve">474249</w:t>
+                  </w:r>
+                </w:p>
+              </w:tc>
+              <w:tc>
+                <w:tcPr/>
+                <w:p>
+                  <w:pPr>
+                    <w:pStyle w:val="Compact"/>
+                    <w:jc w:val="right"/>
+                    <w:jc w:val="center"/>
+                  </w:pPr>
+                  <w:r>
+                    <w:t xml:space="preserve">474249</w:t>
                   </w:r>
                 </w:p>
               </w:tc>
@@ -16830,20 +17239,20 @@
                     <w:jc w:val="center"/>
                   </w:pPr>
                   <w:r>
-                    <w:t xml:space="preserve">481447</w:t>
-                  </w:r>
-                </w:p>
-              </w:tc>
-              <w:tc>
-                <w:tcPr/>
-                <w:p>
-                  <w:pPr>
-                    <w:pStyle w:val="Compact"/>
-                    <w:jc w:val="right"/>
-                    <w:jc w:val="center"/>
-                  </w:pPr>
-                  <w:r>
-                    <w:t xml:space="preserve">481447</w:t>
+                    <w:t xml:space="preserve">474249</w:t>
+                  </w:r>
+                </w:p>
+              </w:tc>
+              <w:tc>
+                <w:tcPr/>
+                <w:p>
+                  <w:pPr>
+                    <w:pStyle w:val="Compact"/>
+                    <w:jc w:val="right"/>
+                    <w:jc w:val="center"/>
+                  </w:pPr>
+                  <w:r>
+                    <w:t xml:space="preserve">474249</w:t>
                   </w:r>
                 </w:p>
               </w:tc>
@@ -16962,20 +17371,20 @@
                     <w:jc w:val="center"/>
                   </w:pPr>
                   <w:r>
-                    <w:t xml:space="preserve">481447</w:t>
-                  </w:r>
-                </w:p>
-              </w:tc>
-              <w:tc>
-                <w:tcPr/>
-                <w:p>
-                  <w:pPr>
-                    <w:pStyle w:val="Compact"/>
-                    <w:jc w:val="right"/>
-                    <w:jc w:val="center"/>
-                  </w:pPr>
-                  <w:r>
-                    <w:t xml:space="preserve">481447</w:t>
+                    <w:t xml:space="preserve">474249</w:t>
+                  </w:r>
+                </w:p>
+              </w:tc>
+              <w:tc>
+                <w:tcPr/>
+                <w:p>
+                  <w:pPr>
+                    <w:pStyle w:val="Compact"/>
+                    <w:jc w:val="right"/>
+                    <w:jc w:val="center"/>
+                  </w:pPr>
+                  <w:r>
+                    <w:t xml:space="preserve">474249</w:t>
                   </w:r>
                 </w:p>
               </w:tc>
@@ -17094,20 +17503,20 @@
                     <w:jc w:val="center"/>
                   </w:pPr>
                   <w:r>
-                    <w:t xml:space="preserve">481447</w:t>
-                  </w:r>
-                </w:p>
-              </w:tc>
-              <w:tc>
-                <w:tcPr/>
-                <w:p>
-                  <w:pPr>
-                    <w:pStyle w:val="Compact"/>
-                    <w:jc w:val="right"/>
-                    <w:jc w:val="center"/>
-                  </w:pPr>
-                  <w:r>
-                    <w:t xml:space="preserve">481447</w:t>
+                    <w:t xml:space="preserve">474249</w:t>
+                  </w:r>
+                </w:p>
+              </w:tc>
+              <w:tc>
+                <w:tcPr/>
+                <w:p>
+                  <w:pPr>
+                    <w:pStyle w:val="Compact"/>
+                    <w:jc w:val="right"/>
+                    <w:jc w:val="center"/>
+                  </w:pPr>
+                  <w:r>
+                    <w:t xml:space="preserve">474249</w:t>
                   </w:r>
                 </w:p>
               </w:tc>
@@ -17226,20 +17635,20 @@
                     <w:jc w:val="center"/>
                   </w:pPr>
                   <w:r>
-                    <w:t xml:space="preserve">481447</w:t>
-                  </w:r>
-                </w:p>
-              </w:tc>
-              <w:tc>
-                <w:tcPr/>
-                <w:p>
-                  <w:pPr>
-                    <w:pStyle w:val="Compact"/>
-                    <w:jc w:val="right"/>
-                    <w:jc w:val="center"/>
-                  </w:pPr>
-                  <w:r>
-                    <w:t xml:space="preserve">481447</w:t>
+                    <w:t xml:space="preserve">474249</w:t>
+                  </w:r>
+                </w:p>
+              </w:tc>
+              <w:tc>
+                <w:tcPr/>
+                <w:p>
+                  <w:pPr>
+                    <w:pStyle w:val="Compact"/>
+                    <w:jc w:val="right"/>
+                    <w:jc w:val="center"/>
+                  </w:pPr>
+                  <w:r>
+                    <w:t xml:space="preserve">474249</w:t>
                   </w:r>
                 </w:p>
               </w:tc>
@@ -17297,12 +17706,31 @@
               </w:tc>
             </w:tr>
           </w:tbl>
-          <w:bookmarkEnd w:id="27"/>
+          <w:bookmarkEnd w:id="18"/>
           <w:p/>
         </w:tc>
       </w:tr>
     </w:tbl>
-    <w:bookmarkEnd w:id="28"/>
+    <w:bookmarkEnd w:id="19"/>
+    <w:bookmarkEnd w:id="20"/>
+    <w:bookmarkStart w:id="21" w:name="european-exposure-data"/>
+    <w:p>
+      <w:pPr>
+        <w:pStyle w:val="Heading2"/>
+      </w:pPr>
+      <w:r>
+        <w:t xml:space="preserve">European exposure data</w:t>
+      </w:r>
+    </w:p>
+    <w:p>
+      <w:pPr>
+        <w:pStyle w:val="FirstParagraph"/>
+      </w:pPr>
+      <w:r>
+        <w:t xml:space="preserve">Similar to the abeovementioned German data, here for the all european exposure data.</w:t>
+      </w:r>
+    </w:p>
+    <w:bookmarkEnd w:id="21"/>
     <w:sectPr>
       <w:footnotePr>
         <w:numRestart w:val="eachSect"/>
@@ -17424,10 +17852,10 @@
   <w:docDefaults>
     <w:rPrDefault>
       <w:rPr>
-        <w:rFonts w:asciiTheme="minorHAnsi" w:cstheme="minorBidi" w:eastAsiaTheme="minorHAnsi" w:hAnsiTheme="minorHAnsi"/>
+        <w:rFonts w:asciiTheme="minorHAnsi" w:cstheme="minorBidi" w:eastAsiaTheme="minorEastAsia" w:hAnsiTheme="minorHAnsi"/>
         <w:sz w:val="24"/>
         <w:szCs w:val="24"/>
-        <w:lang w:bidi="ar-SA" w:eastAsia="en-US" w:val="en-US"/>
+        <w:lang w:bidi="ar-SA" w:eastAsia="zh-CN" w:val="en-US"/>
       </w:rPr>
     </w:rPrDefault>
     <w:pPrDefault>
@@ -17968,13 +18396,6 @@
       </w:tblCellMar>
     </w:tblPr>
     <w:tblStylePr w:type="firstRow">
-      <w:tblPr>
-        <w:jc w:val="left"/>
-        <w:tblInd w:type="dxa" w:w="0"/>
-      </w:tblPr>
-      <w:trPr>
-        <w:jc w:val="left"/>
-      </w:trPr>
       <w:tcPr>
         <w:tcBorders>
           <w:bottom w:val="single"/>

</xml_diff>